<commit_message>
add test and check run ci-cd actions at github
</commit_message>
<xml_diff>
--- a/conspect/конспект.docx
+++ b/conspect/конспект.docx
@@ -52,7 +52,7 @@
           <w:szCs w:val="32"/>
           <w:lang w:val="en-US" w:eastAsia="zh-CN" w:bidi="ar-SA"/>
         </w:rPr>
-        <w:instrText xml:space="preserve"> HYPERLINK \l _Toc14796 </w:instrText>
+        <w:instrText xml:space="preserve"> HYPERLINK \l _Toc32000 </w:instrText>
       </w:r>
       <w:r>
         <w:rPr>
@@ -102,7 +102,7 @@
           <w:szCs w:val="32"/>
           <w:lang w:val="en-US" w:eastAsia="zh-CN" w:bidi="ar-SA"/>
         </w:rPr>
-        <w:instrText xml:space="preserve"> PAGEREF _Toc14796 </w:instrText>
+        <w:instrText xml:space="preserve"> PAGEREF _Toc32000 </w:instrText>
       </w:r>
       <w:r>
         <w:rPr>
@@ -177,7 +177,7 @@
           <w:szCs w:val="32"/>
           <w:lang w:val="en-US" w:eastAsia="zh-CN" w:bidi="ar-SA"/>
         </w:rPr>
-        <w:instrText xml:space="preserve"> HYPERLINK \l _Toc20107 </w:instrText>
+        <w:instrText xml:space="preserve"> HYPERLINK \l _Toc10564 </w:instrText>
       </w:r>
       <w:r>
         <w:rPr>
@@ -227,7 +227,7 @@
           <w:szCs w:val="32"/>
           <w:lang w:val="en-US" w:eastAsia="zh-CN" w:bidi="ar-SA"/>
         </w:rPr>
-        <w:instrText xml:space="preserve"> PAGEREF _Toc20107 </w:instrText>
+        <w:instrText xml:space="preserve"> PAGEREF _Toc10564 </w:instrText>
       </w:r>
       <w:r>
         <w:rPr>
@@ -302,7 +302,7 @@
           <w:szCs w:val="32"/>
           <w:lang w:val="en-US" w:eastAsia="zh-CN" w:bidi="ar-SA"/>
         </w:rPr>
-        <w:instrText xml:space="preserve"> HYPERLINK \l _Toc1115 </w:instrText>
+        <w:instrText xml:space="preserve"> HYPERLINK \l _Toc15017 </w:instrText>
       </w:r>
       <w:r>
         <w:rPr>
@@ -352,7 +352,7 @@
           <w:szCs w:val="32"/>
           <w:lang w:val="en-US" w:eastAsia="zh-CN" w:bidi="ar-SA"/>
         </w:rPr>
-        <w:instrText xml:space="preserve"> PAGEREF _Toc1115 </w:instrText>
+        <w:instrText xml:space="preserve"> PAGEREF _Toc15017 </w:instrText>
       </w:r>
       <w:r>
         <w:rPr>
@@ -427,7 +427,7 @@
           <w:szCs w:val="32"/>
           <w:lang w:val="en-US" w:eastAsia="zh-CN" w:bidi="ar-SA"/>
         </w:rPr>
-        <w:instrText xml:space="preserve"> HYPERLINK \l _Toc24054 </w:instrText>
+        <w:instrText xml:space="preserve"> HYPERLINK \l _Toc19737 </w:instrText>
       </w:r>
       <w:r>
         <w:rPr>
@@ -477,7 +477,7 @@
           <w:szCs w:val="32"/>
           <w:lang w:val="en-US" w:eastAsia="zh-CN" w:bidi="ar-SA"/>
         </w:rPr>
-        <w:instrText xml:space="preserve"> PAGEREF _Toc24054 </w:instrText>
+        <w:instrText xml:space="preserve"> PAGEREF _Toc19737 </w:instrText>
       </w:r>
       <w:r>
         <w:rPr>
@@ -552,7 +552,7 @@
           <w:szCs w:val="32"/>
           <w:lang w:val="en-US" w:eastAsia="zh-CN" w:bidi="ar-SA"/>
         </w:rPr>
-        <w:instrText xml:space="preserve"> HYPERLINK \l _Toc6769 </w:instrText>
+        <w:instrText xml:space="preserve"> HYPERLINK \l _Toc26207 </w:instrText>
       </w:r>
       <w:r>
         <w:rPr>
@@ -602,7 +602,7 @@
           <w:szCs w:val="32"/>
           <w:lang w:val="en-US" w:eastAsia="zh-CN" w:bidi="ar-SA"/>
         </w:rPr>
-        <w:instrText xml:space="preserve"> PAGEREF _Toc6769 </w:instrText>
+        <w:instrText xml:space="preserve"> PAGEREF _Toc26207 </w:instrText>
       </w:r>
       <w:r>
         <w:rPr>
@@ -677,7 +677,7 @@
           <w:szCs w:val="32"/>
           <w:lang w:val="en-US" w:eastAsia="zh-CN" w:bidi="ar-SA"/>
         </w:rPr>
-        <w:instrText xml:space="preserve"> HYPERLINK \l _Toc6603 </w:instrText>
+        <w:instrText xml:space="preserve"> HYPERLINK \l _Toc31613 </w:instrText>
       </w:r>
       <w:r>
         <w:rPr>
@@ -727,7 +727,7 @@
           <w:szCs w:val="32"/>
           <w:lang w:val="en-US" w:eastAsia="zh-CN" w:bidi="ar-SA"/>
         </w:rPr>
-        <w:instrText xml:space="preserve"> PAGEREF _Toc6603 </w:instrText>
+        <w:instrText xml:space="preserve"> PAGEREF _Toc31613 </w:instrText>
       </w:r>
       <w:r>
         <w:rPr>
@@ -802,7 +802,7 @@
           <w:szCs w:val="32"/>
           <w:lang w:val="en-US" w:eastAsia="zh-CN" w:bidi="ar-SA"/>
         </w:rPr>
-        <w:instrText xml:space="preserve"> HYPERLINK \l _Toc2892 </w:instrText>
+        <w:instrText xml:space="preserve"> HYPERLINK \l _Toc24897 </w:instrText>
       </w:r>
       <w:r>
         <w:rPr>
@@ -852,7 +852,7 @@
           <w:szCs w:val="32"/>
           <w:lang w:val="en-US" w:eastAsia="zh-CN" w:bidi="ar-SA"/>
         </w:rPr>
-        <w:instrText xml:space="preserve"> PAGEREF _Toc2892 </w:instrText>
+        <w:instrText xml:space="preserve"> PAGEREF _Toc24897 </w:instrText>
       </w:r>
       <w:r>
         <w:rPr>
@@ -927,7 +927,7 @@
           <w:szCs w:val="32"/>
           <w:lang w:val="en-US" w:eastAsia="zh-CN" w:bidi="ar-SA"/>
         </w:rPr>
-        <w:instrText xml:space="preserve"> HYPERLINK \l _Toc32329 </w:instrText>
+        <w:instrText xml:space="preserve"> HYPERLINK \l _Toc10446 </w:instrText>
       </w:r>
       <w:r>
         <w:rPr>
@@ -977,7 +977,7 @@
           <w:szCs w:val="32"/>
           <w:lang w:val="en-US" w:eastAsia="zh-CN" w:bidi="ar-SA"/>
         </w:rPr>
-        <w:instrText xml:space="preserve"> PAGEREF _Toc32329 </w:instrText>
+        <w:instrText xml:space="preserve"> PAGEREF _Toc10446 </w:instrText>
       </w:r>
       <w:r>
         <w:rPr>
@@ -1052,7 +1052,7 @@
           <w:szCs w:val="32"/>
           <w:lang w:val="en-US" w:eastAsia="zh-CN" w:bidi="ar-SA"/>
         </w:rPr>
-        <w:instrText xml:space="preserve"> HYPERLINK \l _Toc19521 </w:instrText>
+        <w:instrText xml:space="preserve"> HYPERLINK \l _Toc28423 </w:instrText>
       </w:r>
       <w:r>
         <w:rPr>
@@ -1102,7 +1102,7 @@
           <w:szCs w:val="32"/>
           <w:lang w:val="en-US" w:eastAsia="zh-CN" w:bidi="ar-SA"/>
         </w:rPr>
-        <w:instrText xml:space="preserve"> PAGEREF _Toc19521 </w:instrText>
+        <w:instrText xml:space="preserve"> PAGEREF _Toc28423 </w:instrText>
       </w:r>
       <w:r>
         <w:rPr>
@@ -1177,7 +1177,7 @@
           <w:szCs w:val="32"/>
           <w:lang w:val="en-US" w:eastAsia="zh-CN" w:bidi="ar-SA"/>
         </w:rPr>
-        <w:instrText xml:space="preserve"> HYPERLINK \l _Toc13630 </w:instrText>
+        <w:instrText xml:space="preserve"> HYPERLINK \l _Toc28527 </w:instrText>
       </w:r>
       <w:r>
         <w:rPr>
@@ -1227,7 +1227,7 @@
           <w:szCs w:val="32"/>
           <w:lang w:val="en-US" w:eastAsia="zh-CN" w:bidi="ar-SA"/>
         </w:rPr>
-        <w:instrText xml:space="preserve"> PAGEREF _Toc13630 </w:instrText>
+        <w:instrText xml:space="preserve"> PAGEREF _Toc28527 </w:instrText>
       </w:r>
       <w:r>
         <w:rPr>
@@ -1302,7 +1302,7 @@
           <w:szCs w:val="32"/>
           <w:lang w:val="en-US" w:eastAsia="zh-CN" w:bidi="ar-SA"/>
         </w:rPr>
-        <w:instrText xml:space="preserve"> HYPERLINK \l _Toc27271 </w:instrText>
+        <w:instrText xml:space="preserve"> HYPERLINK \l _Toc14315 </w:instrText>
       </w:r>
       <w:r>
         <w:rPr>
@@ -1352,7 +1352,7 @@
           <w:szCs w:val="32"/>
           <w:lang w:val="en-US" w:eastAsia="zh-CN" w:bidi="ar-SA"/>
         </w:rPr>
-        <w:instrText xml:space="preserve"> PAGEREF _Toc27271 </w:instrText>
+        <w:instrText xml:space="preserve"> PAGEREF _Toc14315 </w:instrText>
       </w:r>
       <w:r>
         <w:rPr>
@@ -1427,7 +1427,7 @@
           <w:szCs w:val="32"/>
           <w:lang w:val="en-US" w:eastAsia="zh-CN" w:bidi="ar-SA"/>
         </w:rPr>
-        <w:instrText xml:space="preserve"> HYPERLINK \l _Toc32543 </w:instrText>
+        <w:instrText xml:space="preserve"> HYPERLINK \l _Toc30858 </w:instrText>
       </w:r>
       <w:r>
         <w:rPr>
@@ -1477,7 +1477,7 @@
           <w:szCs w:val="32"/>
           <w:lang w:val="en-US" w:eastAsia="zh-CN" w:bidi="ar-SA"/>
         </w:rPr>
-        <w:instrText xml:space="preserve"> PAGEREF _Toc32543 </w:instrText>
+        <w:instrText xml:space="preserve"> PAGEREF _Toc30858 </w:instrText>
       </w:r>
       <w:r>
         <w:rPr>
@@ -1552,7 +1552,7 @@
           <w:szCs w:val="32"/>
           <w:lang w:val="en-US" w:eastAsia="zh-CN" w:bidi="ar-SA"/>
         </w:rPr>
-        <w:instrText xml:space="preserve"> HYPERLINK \l _Toc21618 </w:instrText>
+        <w:instrText xml:space="preserve"> HYPERLINK \l _Toc17122 </w:instrText>
       </w:r>
       <w:r>
         <w:rPr>
@@ -1602,7 +1602,7 @@
           <w:szCs w:val="32"/>
           <w:lang w:val="en-US" w:eastAsia="zh-CN" w:bidi="ar-SA"/>
         </w:rPr>
-        <w:instrText xml:space="preserve"> PAGEREF _Toc21618 </w:instrText>
+        <w:instrText xml:space="preserve"> PAGEREF _Toc17122 </w:instrText>
       </w:r>
       <w:r>
         <w:rPr>
@@ -1677,7 +1677,7 @@
           <w:szCs w:val="32"/>
           <w:lang w:val="en-US" w:eastAsia="zh-CN" w:bidi="ar-SA"/>
         </w:rPr>
-        <w:instrText xml:space="preserve"> HYPERLINK \l _Toc18902 </w:instrText>
+        <w:instrText xml:space="preserve"> HYPERLINK \l _Toc28653 </w:instrText>
       </w:r>
       <w:r>
         <w:rPr>
@@ -1727,7 +1727,7 @@
           <w:szCs w:val="32"/>
           <w:lang w:val="en-US" w:eastAsia="zh-CN" w:bidi="ar-SA"/>
         </w:rPr>
-        <w:instrText xml:space="preserve"> PAGEREF _Toc18902 </w:instrText>
+        <w:instrText xml:space="preserve"> PAGEREF _Toc28653 </w:instrText>
       </w:r>
       <w:r>
         <w:rPr>
@@ -1802,7 +1802,7 @@
           <w:szCs w:val="32"/>
           <w:lang w:val="en-US" w:eastAsia="zh-CN" w:bidi="ar-SA"/>
         </w:rPr>
-        <w:instrText xml:space="preserve"> HYPERLINK \l _Toc15750 </w:instrText>
+        <w:instrText xml:space="preserve"> HYPERLINK \l _Toc29317 </w:instrText>
       </w:r>
       <w:r>
         <w:rPr>
@@ -1852,7 +1852,7 @@
           <w:szCs w:val="32"/>
           <w:lang w:val="en-US" w:eastAsia="zh-CN" w:bidi="ar-SA"/>
         </w:rPr>
-        <w:instrText xml:space="preserve"> PAGEREF _Toc15750 </w:instrText>
+        <w:instrText xml:space="preserve"> PAGEREF _Toc29317 </w:instrText>
       </w:r>
       <w:r>
         <w:rPr>
@@ -1927,7 +1927,7 @@
           <w:szCs w:val="32"/>
           <w:lang w:val="en-US" w:eastAsia="zh-CN" w:bidi="ar-SA"/>
         </w:rPr>
-        <w:instrText xml:space="preserve"> HYPERLINK \l _Toc2836 </w:instrText>
+        <w:instrText xml:space="preserve"> HYPERLINK \l _Toc965 </w:instrText>
       </w:r>
       <w:r>
         <w:rPr>
@@ -1977,7 +1977,7 @@
           <w:szCs w:val="32"/>
           <w:lang w:val="en-US" w:eastAsia="zh-CN" w:bidi="ar-SA"/>
         </w:rPr>
-        <w:instrText xml:space="preserve"> PAGEREF _Toc2836 </w:instrText>
+        <w:instrText xml:space="preserve"> PAGEREF _Toc965 </w:instrText>
       </w:r>
       <w:r>
         <w:rPr>
@@ -2052,7 +2052,7 @@
           <w:szCs w:val="32"/>
           <w:lang w:val="en-US" w:eastAsia="zh-CN" w:bidi="ar-SA"/>
         </w:rPr>
-        <w:instrText xml:space="preserve"> HYPERLINK \l _Toc31743 </w:instrText>
+        <w:instrText xml:space="preserve"> HYPERLINK \l _Toc8794 </w:instrText>
       </w:r>
       <w:r>
         <w:rPr>
@@ -2102,7 +2102,7 @@
           <w:szCs w:val="32"/>
           <w:lang w:val="en-US" w:eastAsia="zh-CN" w:bidi="ar-SA"/>
         </w:rPr>
-        <w:instrText xml:space="preserve"> PAGEREF _Toc31743 </w:instrText>
+        <w:instrText xml:space="preserve"> PAGEREF _Toc8794 </w:instrText>
       </w:r>
       <w:r>
         <w:rPr>
@@ -2177,7 +2177,7 @@
           <w:szCs w:val="32"/>
           <w:lang w:val="en-US" w:eastAsia="zh-CN" w:bidi="ar-SA"/>
         </w:rPr>
-        <w:instrText xml:space="preserve"> HYPERLINK \l _Toc25133 </w:instrText>
+        <w:instrText xml:space="preserve"> HYPERLINK \l _Toc14153 </w:instrText>
       </w:r>
       <w:r>
         <w:rPr>
@@ -2227,7 +2227,7 @@
           <w:szCs w:val="32"/>
           <w:lang w:val="en-US" w:eastAsia="zh-CN" w:bidi="ar-SA"/>
         </w:rPr>
-        <w:instrText xml:space="preserve"> PAGEREF _Toc25133 </w:instrText>
+        <w:instrText xml:space="preserve"> PAGEREF _Toc14153 </w:instrText>
       </w:r>
       <w:r>
         <w:rPr>
@@ -2302,7 +2302,7 @@
           <w:szCs w:val="32"/>
           <w:lang w:val="en-US" w:eastAsia="zh-CN" w:bidi="ar-SA"/>
         </w:rPr>
-        <w:instrText xml:space="preserve"> HYPERLINK \l _Toc29638 </w:instrText>
+        <w:instrText xml:space="preserve"> HYPERLINK \l _Toc12133 </w:instrText>
       </w:r>
       <w:r>
         <w:rPr>
@@ -2352,7 +2352,7 @@
           <w:szCs w:val="32"/>
           <w:lang w:val="en-US" w:eastAsia="zh-CN" w:bidi="ar-SA"/>
         </w:rPr>
-        <w:instrText xml:space="preserve"> PAGEREF _Toc29638 </w:instrText>
+        <w:instrText xml:space="preserve"> PAGEREF _Toc12133 </w:instrText>
       </w:r>
       <w:r>
         <w:rPr>
@@ -2427,7 +2427,7 @@
           <w:szCs w:val="32"/>
           <w:lang w:val="en-US" w:eastAsia="zh-CN" w:bidi="ar-SA"/>
         </w:rPr>
-        <w:instrText xml:space="preserve"> HYPERLINK \l _Toc26048 </w:instrText>
+        <w:instrText xml:space="preserve"> HYPERLINK \l _Toc18315 </w:instrText>
       </w:r>
       <w:r>
         <w:rPr>
@@ -2477,7 +2477,7 @@
           <w:szCs w:val="32"/>
           <w:lang w:val="en-US" w:eastAsia="zh-CN" w:bidi="ar-SA"/>
         </w:rPr>
-        <w:instrText xml:space="preserve"> PAGEREF _Toc26048 </w:instrText>
+        <w:instrText xml:space="preserve"> PAGEREF _Toc18315 </w:instrText>
       </w:r>
       <w:r>
         <w:rPr>
@@ -2552,7 +2552,7 @@
           <w:szCs w:val="32"/>
           <w:lang w:val="en-US" w:eastAsia="zh-CN" w:bidi="ar-SA"/>
         </w:rPr>
-        <w:instrText xml:space="preserve"> HYPERLINK \l _Toc496 </w:instrText>
+        <w:instrText xml:space="preserve"> HYPERLINK \l _Toc19996 </w:instrText>
       </w:r>
       <w:r>
         <w:rPr>
@@ -2602,7 +2602,7 @@
           <w:szCs w:val="32"/>
           <w:lang w:val="en-US" w:eastAsia="zh-CN" w:bidi="ar-SA"/>
         </w:rPr>
-        <w:instrText xml:space="preserve"> PAGEREF _Toc496 </w:instrText>
+        <w:instrText xml:space="preserve"> PAGEREF _Toc19996 </w:instrText>
       </w:r>
       <w:r>
         <w:rPr>
@@ -2677,7 +2677,7 @@
           <w:szCs w:val="32"/>
           <w:lang w:val="en-US" w:eastAsia="zh-CN" w:bidi="ar-SA"/>
         </w:rPr>
-        <w:instrText xml:space="preserve"> HYPERLINK \l _Toc25533 </w:instrText>
+        <w:instrText xml:space="preserve"> HYPERLINK \l _Toc7181 </w:instrText>
       </w:r>
       <w:r>
         <w:rPr>
@@ -2727,7 +2727,7 @@
           <w:szCs w:val="32"/>
           <w:lang w:val="en-US" w:eastAsia="zh-CN" w:bidi="ar-SA"/>
         </w:rPr>
-        <w:instrText xml:space="preserve"> PAGEREF _Toc25533 </w:instrText>
+        <w:instrText xml:space="preserve"> PAGEREF _Toc7181 </w:instrText>
       </w:r>
       <w:r>
         <w:rPr>
@@ -2802,7 +2802,7 @@
           <w:szCs w:val="32"/>
           <w:lang w:val="en-US" w:eastAsia="zh-CN" w:bidi="ar-SA"/>
         </w:rPr>
-        <w:instrText xml:space="preserve"> HYPERLINK \l _Toc13612 </w:instrText>
+        <w:instrText xml:space="preserve"> HYPERLINK \l _Toc24895 </w:instrText>
       </w:r>
       <w:r>
         <w:rPr>
@@ -2852,7 +2852,7 @@
           <w:szCs w:val="32"/>
           <w:lang w:val="en-US" w:eastAsia="zh-CN" w:bidi="ar-SA"/>
         </w:rPr>
-        <w:instrText xml:space="preserve"> PAGEREF _Toc13612 </w:instrText>
+        <w:instrText xml:space="preserve"> PAGEREF _Toc24895 </w:instrText>
       </w:r>
       <w:r>
         <w:rPr>
@@ -2927,7 +2927,7 @@
           <w:szCs w:val="32"/>
           <w:lang w:val="en-US" w:eastAsia="zh-CN" w:bidi="ar-SA"/>
         </w:rPr>
-        <w:instrText xml:space="preserve"> HYPERLINK \l _Toc17115 </w:instrText>
+        <w:instrText xml:space="preserve"> HYPERLINK \l _Toc18639 </w:instrText>
       </w:r>
       <w:r>
         <w:rPr>
@@ -2977,7 +2977,7 @@
           <w:szCs w:val="32"/>
           <w:lang w:val="en-US" w:eastAsia="zh-CN" w:bidi="ar-SA"/>
         </w:rPr>
-        <w:instrText xml:space="preserve"> PAGEREF _Toc17115 </w:instrText>
+        <w:instrText xml:space="preserve"> PAGEREF _Toc18639 </w:instrText>
       </w:r>
       <w:r>
         <w:rPr>
@@ -3052,7 +3052,7 @@
           <w:szCs w:val="32"/>
           <w:lang w:val="en-US" w:eastAsia="zh-CN" w:bidi="ar-SA"/>
         </w:rPr>
-        <w:instrText xml:space="preserve"> HYPERLINK \l _Toc10323 </w:instrText>
+        <w:instrText xml:space="preserve"> HYPERLINK \l _Toc24604 </w:instrText>
       </w:r>
       <w:r>
         <w:rPr>
@@ -3102,7 +3102,7 @@
           <w:szCs w:val="32"/>
           <w:lang w:val="en-US" w:eastAsia="zh-CN" w:bidi="ar-SA"/>
         </w:rPr>
-        <w:instrText xml:space="preserve"> PAGEREF _Toc10323 </w:instrText>
+        <w:instrText xml:space="preserve"> PAGEREF _Toc24604 </w:instrText>
       </w:r>
       <w:r>
         <w:rPr>
@@ -3177,7 +3177,7 @@
           <w:szCs w:val="32"/>
           <w:lang w:val="en-US" w:eastAsia="zh-CN" w:bidi="ar-SA"/>
         </w:rPr>
-        <w:instrText xml:space="preserve"> HYPERLINK \l _Toc26018 </w:instrText>
+        <w:instrText xml:space="preserve"> HYPERLINK \l _Toc5611 </w:instrText>
       </w:r>
       <w:r>
         <w:rPr>
@@ -3227,7 +3227,7 @@
           <w:szCs w:val="32"/>
           <w:lang w:val="en-US" w:eastAsia="zh-CN" w:bidi="ar-SA"/>
         </w:rPr>
-        <w:instrText xml:space="preserve"> PAGEREF _Toc26018 </w:instrText>
+        <w:instrText xml:space="preserve"> PAGEREF _Toc5611 </w:instrText>
       </w:r>
       <w:r>
         <w:rPr>
@@ -3272,6 +3272,1881 @@
     </w:p>
     <w:p>
       <w:pPr>
+        <w:pStyle w:val="7"/>
+        <w:tabs>
+          <w:tab w:val="right" w:leader="dot" w:pos="10466"/>
+        </w:tabs>
+        <w:rPr>
+          <w:rFonts w:ascii="Arial" w:hAnsi="Arial" w:cs="Arial" w:eastAsiaTheme="minorEastAsia"/>
+          <w:bCs/>
+          <w:kern w:val="32"/>
+          <w:szCs w:val="32"/>
+          <w:lang w:val="en-US" w:eastAsia="zh-CN" w:bidi="ar-SA"/>
+        </w:rPr>
+      </w:pPr>
+      <w:r>
+        <w:rPr>
+          <w:rFonts w:hint="default" w:ascii="Arial" w:hAnsi="Arial" w:cs="Arial" w:eastAsiaTheme="minorEastAsia"/>
+          <w:bCs/>
+          <w:kern w:val="32"/>
+          <w:szCs w:val="32"/>
+          <w:lang w:val="en-US" w:eastAsia="zh-CN" w:bidi="ar-SA"/>
+        </w:rPr>
+        <w:fldChar w:fldCharType="begin"/>
+      </w:r>
+      <w:r>
+        <w:rPr>
+          <w:rFonts w:hint="default" w:ascii="Arial" w:hAnsi="Arial" w:cs="Arial" w:eastAsiaTheme="minorEastAsia"/>
+          <w:bCs/>
+          <w:kern w:val="32"/>
+          <w:szCs w:val="32"/>
+          <w:lang w:val="en-US" w:eastAsia="zh-CN" w:bidi="ar-SA"/>
+        </w:rPr>
+        <w:instrText xml:space="preserve"> HYPERLINK \l _Toc4168 </w:instrText>
+      </w:r>
+      <w:r>
+        <w:rPr>
+          <w:rFonts w:hint="default" w:ascii="Arial" w:hAnsi="Arial" w:cs="Arial" w:eastAsiaTheme="minorEastAsia"/>
+          <w:bCs/>
+          <w:kern w:val="32"/>
+          <w:szCs w:val="32"/>
+          <w:lang w:val="en-US" w:eastAsia="zh-CN" w:bidi="ar-SA"/>
+        </w:rPr>
+        <w:fldChar w:fldCharType="separate"/>
+      </w:r>
+      <w:r>
+        <w:rPr>
+          <w:rFonts w:hint="default" w:ascii="Arial" w:hAnsi="Arial" w:cs="Arial" w:eastAsiaTheme="minorEastAsia"/>
+          <w:bCs/>
+          <w:kern w:val="32"/>
+          <w:szCs w:val="32"/>
+          <w:lang w:val="en-US" w:eastAsia="zh-CN" w:bidi="ar-SA"/>
+        </w:rPr>
+        <w:t>5.1 Работа с AJAX и динамическими элементами</w:t>
+      </w:r>
+      <w:r>
+        <w:rPr>
+          <w:rFonts w:ascii="Arial" w:hAnsi="Arial" w:cs="Arial" w:eastAsiaTheme="minorEastAsia"/>
+          <w:bCs/>
+          <w:kern w:val="32"/>
+          <w:szCs w:val="32"/>
+          <w:lang w:val="en-US" w:eastAsia="zh-CN" w:bidi="ar-SA"/>
+        </w:rPr>
+        <w:tab/>
+      </w:r>
+      <w:r>
+        <w:rPr>
+          <w:rFonts w:ascii="Arial" w:hAnsi="Arial" w:cs="Arial" w:eastAsiaTheme="minorEastAsia"/>
+          <w:bCs/>
+          <w:kern w:val="32"/>
+          <w:szCs w:val="32"/>
+          <w:lang w:val="en-US" w:eastAsia="zh-CN" w:bidi="ar-SA"/>
+        </w:rPr>
+        <w:fldChar w:fldCharType="begin"/>
+      </w:r>
+      <w:r>
+        <w:rPr>
+          <w:rFonts w:ascii="Arial" w:hAnsi="Arial" w:cs="Arial" w:eastAsiaTheme="minorEastAsia"/>
+          <w:bCs/>
+          <w:kern w:val="32"/>
+          <w:szCs w:val="32"/>
+          <w:lang w:val="en-US" w:eastAsia="zh-CN" w:bidi="ar-SA"/>
+        </w:rPr>
+        <w:instrText xml:space="preserve"> PAGEREF _Toc4168 </w:instrText>
+      </w:r>
+      <w:r>
+        <w:rPr>
+          <w:rFonts w:ascii="Arial" w:hAnsi="Arial" w:cs="Arial" w:eastAsiaTheme="minorEastAsia"/>
+          <w:bCs/>
+          <w:kern w:val="32"/>
+          <w:szCs w:val="32"/>
+          <w:lang w:val="en-US" w:eastAsia="zh-CN" w:bidi="ar-SA"/>
+        </w:rPr>
+        <w:fldChar w:fldCharType="separate"/>
+      </w:r>
+      <w:r>
+        <w:rPr>
+          <w:rFonts w:ascii="Arial" w:hAnsi="Arial" w:cs="Arial" w:eastAsiaTheme="minorEastAsia"/>
+          <w:bCs/>
+          <w:kern w:val="32"/>
+          <w:szCs w:val="32"/>
+          <w:lang w:val="en-US" w:eastAsia="zh-CN" w:bidi="ar-SA"/>
+        </w:rPr>
+        <w:t>11</w:t>
+      </w:r>
+      <w:r>
+        <w:rPr>
+          <w:rFonts w:ascii="Arial" w:hAnsi="Arial" w:cs="Arial" w:eastAsiaTheme="minorEastAsia"/>
+          <w:bCs/>
+          <w:kern w:val="32"/>
+          <w:szCs w:val="32"/>
+          <w:lang w:val="en-US" w:eastAsia="zh-CN" w:bidi="ar-SA"/>
+        </w:rPr>
+        <w:fldChar w:fldCharType="end"/>
+      </w:r>
+      <w:r>
+        <w:rPr>
+          <w:rFonts w:hint="default" w:ascii="Arial" w:hAnsi="Arial" w:cs="Arial" w:eastAsiaTheme="minorEastAsia"/>
+          <w:bCs/>
+          <w:kern w:val="32"/>
+          <w:szCs w:val="32"/>
+          <w:lang w:val="en-US" w:eastAsia="zh-CN" w:bidi="ar-SA"/>
+        </w:rPr>
+        <w:fldChar w:fldCharType="end"/>
+      </w:r>
+    </w:p>
+    <w:p>
+      <w:pPr>
+        <w:pStyle w:val="10"/>
+        <w:tabs>
+          <w:tab w:val="right" w:leader="dot" w:pos="10466"/>
+        </w:tabs>
+        <w:rPr>
+          <w:rFonts w:ascii="Arial" w:hAnsi="Arial" w:cs="Arial" w:eastAsiaTheme="minorEastAsia"/>
+          <w:bCs/>
+          <w:kern w:val="32"/>
+          <w:szCs w:val="32"/>
+          <w:lang w:val="en-US" w:eastAsia="zh-CN" w:bidi="ar-SA"/>
+        </w:rPr>
+      </w:pPr>
+      <w:r>
+        <w:rPr>
+          <w:rFonts w:hint="default" w:ascii="Arial" w:hAnsi="Arial" w:cs="Arial" w:eastAsiaTheme="minorEastAsia"/>
+          <w:bCs/>
+          <w:kern w:val="32"/>
+          <w:szCs w:val="32"/>
+          <w:lang w:val="en-US" w:eastAsia="zh-CN" w:bidi="ar-SA"/>
+        </w:rPr>
+        <w:fldChar w:fldCharType="begin"/>
+      </w:r>
+      <w:r>
+        <w:rPr>
+          <w:rFonts w:hint="default" w:ascii="Arial" w:hAnsi="Arial" w:cs="Arial" w:eastAsiaTheme="minorEastAsia"/>
+          <w:bCs/>
+          <w:kern w:val="32"/>
+          <w:szCs w:val="32"/>
+          <w:lang w:val="en-US" w:eastAsia="zh-CN" w:bidi="ar-SA"/>
+        </w:rPr>
+        <w:instrText xml:space="preserve"> HYPERLINK \l _Toc24833 </w:instrText>
+      </w:r>
+      <w:r>
+        <w:rPr>
+          <w:rFonts w:hint="default" w:ascii="Arial" w:hAnsi="Arial" w:cs="Arial" w:eastAsiaTheme="minorEastAsia"/>
+          <w:bCs/>
+          <w:kern w:val="32"/>
+          <w:szCs w:val="32"/>
+          <w:lang w:val="en-US" w:eastAsia="zh-CN" w:bidi="ar-SA"/>
+        </w:rPr>
+        <w:fldChar w:fldCharType="separate"/>
+      </w:r>
+      <w:r>
+        <w:rPr>
+          <w:rFonts w:hint="default" w:ascii="Arial" w:hAnsi="Arial" w:cs="Arial" w:eastAsiaTheme="minorEastAsia"/>
+          <w:bCs/>
+          <w:kern w:val="32"/>
+          <w:szCs w:val="32"/>
+          <w:lang w:val="en-US" w:eastAsia="zh-CN" w:bidi="ar-SA"/>
+        </w:rPr>
+        <w:t>Работа с AJAX и динамическими элементами</w:t>
+      </w:r>
+      <w:r>
+        <w:rPr>
+          <w:rFonts w:ascii="Arial" w:hAnsi="Arial" w:cs="Arial" w:eastAsiaTheme="minorEastAsia"/>
+          <w:bCs/>
+          <w:kern w:val="32"/>
+          <w:szCs w:val="32"/>
+          <w:lang w:val="en-US" w:eastAsia="zh-CN" w:bidi="ar-SA"/>
+        </w:rPr>
+        <w:tab/>
+      </w:r>
+      <w:r>
+        <w:rPr>
+          <w:rFonts w:ascii="Arial" w:hAnsi="Arial" w:cs="Arial" w:eastAsiaTheme="minorEastAsia"/>
+          <w:bCs/>
+          <w:kern w:val="32"/>
+          <w:szCs w:val="32"/>
+          <w:lang w:val="en-US" w:eastAsia="zh-CN" w:bidi="ar-SA"/>
+        </w:rPr>
+        <w:fldChar w:fldCharType="begin"/>
+      </w:r>
+      <w:r>
+        <w:rPr>
+          <w:rFonts w:ascii="Arial" w:hAnsi="Arial" w:cs="Arial" w:eastAsiaTheme="minorEastAsia"/>
+          <w:bCs/>
+          <w:kern w:val="32"/>
+          <w:szCs w:val="32"/>
+          <w:lang w:val="en-US" w:eastAsia="zh-CN" w:bidi="ar-SA"/>
+        </w:rPr>
+        <w:instrText xml:space="preserve"> PAGEREF _Toc24833 </w:instrText>
+      </w:r>
+      <w:r>
+        <w:rPr>
+          <w:rFonts w:ascii="Arial" w:hAnsi="Arial" w:cs="Arial" w:eastAsiaTheme="minorEastAsia"/>
+          <w:bCs/>
+          <w:kern w:val="32"/>
+          <w:szCs w:val="32"/>
+          <w:lang w:val="en-US" w:eastAsia="zh-CN" w:bidi="ar-SA"/>
+        </w:rPr>
+        <w:fldChar w:fldCharType="separate"/>
+      </w:r>
+      <w:r>
+        <w:rPr>
+          <w:rFonts w:ascii="Arial" w:hAnsi="Arial" w:cs="Arial" w:eastAsiaTheme="minorEastAsia"/>
+          <w:bCs/>
+          <w:kern w:val="32"/>
+          <w:szCs w:val="32"/>
+          <w:lang w:val="en-US" w:eastAsia="zh-CN" w:bidi="ar-SA"/>
+        </w:rPr>
+        <w:t>11</w:t>
+      </w:r>
+      <w:r>
+        <w:rPr>
+          <w:rFonts w:ascii="Arial" w:hAnsi="Arial" w:cs="Arial" w:eastAsiaTheme="minorEastAsia"/>
+          <w:bCs/>
+          <w:kern w:val="32"/>
+          <w:szCs w:val="32"/>
+          <w:lang w:val="en-US" w:eastAsia="zh-CN" w:bidi="ar-SA"/>
+        </w:rPr>
+        <w:fldChar w:fldCharType="end"/>
+      </w:r>
+      <w:r>
+        <w:rPr>
+          <w:rFonts w:hint="default" w:ascii="Arial" w:hAnsi="Arial" w:cs="Arial" w:eastAsiaTheme="minorEastAsia"/>
+          <w:bCs/>
+          <w:kern w:val="32"/>
+          <w:szCs w:val="32"/>
+          <w:lang w:val="en-US" w:eastAsia="zh-CN" w:bidi="ar-SA"/>
+        </w:rPr>
+        <w:fldChar w:fldCharType="end"/>
+      </w:r>
+    </w:p>
+    <w:p>
+      <w:pPr>
+        <w:pStyle w:val="10"/>
+        <w:tabs>
+          <w:tab w:val="right" w:leader="dot" w:pos="10466"/>
+        </w:tabs>
+        <w:rPr>
+          <w:rFonts w:ascii="Arial" w:hAnsi="Arial" w:cs="Arial" w:eastAsiaTheme="minorEastAsia"/>
+          <w:bCs/>
+          <w:kern w:val="32"/>
+          <w:szCs w:val="32"/>
+          <w:lang w:val="en-US" w:eastAsia="zh-CN" w:bidi="ar-SA"/>
+        </w:rPr>
+      </w:pPr>
+      <w:r>
+        <w:rPr>
+          <w:rFonts w:hint="default" w:ascii="Arial" w:hAnsi="Arial" w:cs="Arial" w:eastAsiaTheme="minorEastAsia"/>
+          <w:bCs/>
+          <w:kern w:val="32"/>
+          <w:szCs w:val="32"/>
+          <w:lang w:val="en-US" w:eastAsia="zh-CN" w:bidi="ar-SA"/>
+        </w:rPr>
+        <w:fldChar w:fldCharType="begin"/>
+      </w:r>
+      <w:r>
+        <w:rPr>
+          <w:rFonts w:hint="default" w:ascii="Arial" w:hAnsi="Arial" w:cs="Arial" w:eastAsiaTheme="minorEastAsia"/>
+          <w:bCs/>
+          <w:kern w:val="32"/>
+          <w:szCs w:val="32"/>
+          <w:lang w:val="en-US" w:eastAsia="zh-CN" w:bidi="ar-SA"/>
+        </w:rPr>
+        <w:instrText xml:space="preserve"> HYPERLINK \l _Toc13785 </w:instrText>
+      </w:r>
+      <w:r>
+        <w:rPr>
+          <w:rFonts w:hint="default" w:ascii="Arial" w:hAnsi="Arial" w:cs="Arial" w:eastAsiaTheme="minorEastAsia"/>
+          <w:bCs/>
+          <w:kern w:val="32"/>
+          <w:szCs w:val="32"/>
+          <w:lang w:val="en-US" w:eastAsia="zh-CN" w:bidi="ar-SA"/>
+        </w:rPr>
+        <w:fldChar w:fldCharType="separate"/>
+      </w:r>
+      <w:r>
+        <w:rPr>
+          <w:rFonts w:hint="default" w:ascii="Arial" w:hAnsi="Arial" w:cs="Arial" w:eastAsiaTheme="minorEastAsia"/>
+          <w:bCs/>
+          <w:kern w:val="32"/>
+          <w:szCs w:val="32"/>
+          <w:lang w:val="en-US" w:eastAsia="zh-CN" w:bidi="ar-SA"/>
+        </w:rPr>
+        <w:t>Проблемы при тестировании</w:t>
+      </w:r>
+      <w:r>
+        <w:rPr>
+          <w:rFonts w:ascii="Arial" w:hAnsi="Arial" w:cs="Arial" w:eastAsiaTheme="minorEastAsia"/>
+          <w:bCs/>
+          <w:kern w:val="32"/>
+          <w:szCs w:val="32"/>
+          <w:lang w:val="en-US" w:eastAsia="zh-CN" w:bidi="ar-SA"/>
+        </w:rPr>
+        <w:tab/>
+      </w:r>
+      <w:r>
+        <w:rPr>
+          <w:rFonts w:ascii="Arial" w:hAnsi="Arial" w:cs="Arial" w:eastAsiaTheme="minorEastAsia"/>
+          <w:bCs/>
+          <w:kern w:val="32"/>
+          <w:szCs w:val="32"/>
+          <w:lang w:val="en-US" w:eastAsia="zh-CN" w:bidi="ar-SA"/>
+        </w:rPr>
+        <w:fldChar w:fldCharType="begin"/>
+      </w:r>
+      <w:r>
+        <w:rPr>
+          <w:rFonts w:ascii="Arial" w:hAnsi="Arial" w:cs="Arial" w:eastAsiaTheme="minorEastAsia"/>
+          <w:bCs/>
+          <w:kern w:val="32"/>
+          <w:szCs w:val="32"/>
+          <w:lang w:val="en-US" w:eastAsia="zh-CN" w:bidi="ar-SA"/>
+        </w:rPr>
+        <w:instrText xml:space="preserve"> PAGEREF _Toc13785 </w:instrText>
+      </w:r>
+      <w:r>
+        <w:rPr>
+          <w:rFonts w:ascii="Arial" w:hAnsi="Arial" w:cs="Arial" w:eastAsiaTheme="minorEastAsia"/>
+          <w:bCs/>
+          <w:kern w:val="32"/>
+          <w:szCs w:val="32"/>
+          <w:lang w:val="en-US" w:eastAsia="zh-CN" w:bidi="ar-SA"/>
+        </w:rPr>
+        <w:fldChar w:fldCharType="separate"/>
+      </w:r>
+      <w:r>
+        <w:rPr>
+          <w:rFonts w:ascii="Arial" w:hAnsi="Arial" w:cs="Arial" w:eastAsiaTheme="minorEastAsia"/>
+          <w:bCs/>
+          <w:kern w:val="32"/>
+          <w:szCs w:val="32"/>
+          <w:lang w:val="en-US" w:eastAsia="zh-CN" w:bidi="ar-SA"/>
+        </w:rPr>
+        <w:t>11</w:t>
+      </w:r>
+      <w:r>
+        <w:rPr>
+          <w:rFonts w:ascii="Arial" w:hAnsi="Arial" w:cs="Arial" w:eastAsiaTheme="minorEastAsia"/>
+          <w:bCs/>
+          <w:kern w:val="32"/>
+          <w:szCs w:val="32"/>
+          <w:lang w:val="en-US" w:eastAsia="zh-CN" w:bidi="ar-SA"/>
+        </w:rPr>
+        <w:fldChar w:fldCharType="end"/>
+      </w:r>
+      <w:r>
+        <w:rPr>
+          <w:rFonts w:hint="default" w:ascii="Arial" w:hAnsi="Arial" w:cs="Arial" w:eastAsiaTheme="minorEastAsia"/>
+          <w:bCs/>
+          <w:kern w:val="32"/>
+          <w:szCs w:val="32"/>
+          <w:lang w:val="en-US" w:eastAsia="zh-CN" w:bidi="ar-SA"/>
+        </w:rPr>
+        <w:fldChar w:fldCharType="end"/>
+      </w:r>
+    </w:p>
+    <w:p>
+      <w:pPr>
+        <w:pStyle w:val="10"/>
+        <w:tabs>
+          <w:tab w:val="right" w:leader="dot" w:pos="10466"/>
+        </w:tabs>
+        <w:rPr>
+          <w:rFonts w:ascii="Arial" w:hAnsi="Arial" w:cs="Arial" w:eastAsiaTheme="minorEastAsia"/>
+          <w:bCs/>
+          <w:kern w:val="32"/>
+          <w:szCs w:val="32"/>
+          <w:lang w:val="en-US" w:eastAsia="zh-CN" w:bidi="ar-SA"/>
+        </w:rPr>
+      </w:pPr>
+      <w:r>
+        <w:rPr>
+          <w:rFonts w:hint="default" w:ascii="Arial" w:hAnsi="Arial" w:cs="Arial" w:eastAsiaTheme="minorEastAsia"/>
+          <w:bCs/>
+          <w:kern w:val="32"/>
+          <w:szCs w:val="32"/>
+          <w:lang w:val="en-US" w:eastAsia="zh-CN" w:bidi="ar-SA"/>
+        </w:rPr>
+        <w:fldChar w:fldCharType="begin"/>
+      </w:r>
+      <w:r>
+        <w:rPr>
+          <w:rFonts w:hint="default" w:ascii="Arial" w:hAnsi="Arial" w:cs="Arial" w:eastAsiaTheme="minorEastAsia"/>
+          <w:bCs/>
+          <w:kern w:val="32"/>
+          <w:szCs w:val="32"/>
+          <w:lang w:val="en-US" w:eastAsia="zh-CN" w:bidi="ar-SA"/>
+        </w:rPr>
+        <w:instrText xml:space="preserve"> HYPERLINK \l _Toc3831 </w:instrText>
+      </w:r>
+      <w:r>
+        <w:rPr>
+          <w:rFonts w:hint="default" w:ascii="Arial" w:hAnsi="Arial" w:cs="Arial" w:eastAsiaTheme="minorEastAsia"/>
+          <w:bCs/>
+          <w:kern w:val="32"/>
+          <w:szCs w:val="32"/>
+          <w:lang w:val="en-US" w:eastAsia="zh-CN" w:bidi="ar-SA"/>
+        </w:rPr>
+        <w:fldChar w:fldCharType="separate"/>
+      </w:r>
+      <w:r>
+        <w:rPr>
+          <w:rFonts w:hint="default" w:ascii="Arial" w:hAnsi="Arial" w:cs="Arial" w:eastAsiaTheme="minorEastAsia"/>
+          <w:bCs/>
+          <w:kern w:val="32"/>
+          <w:szCs w:val="32"/>
+          <w:lang w:val="en-US" w:eastAsia="zh-CN" w:bidi="ar-SA"/>
+        </w:rPr>
+        <w:t>Решение: Ожидания (Waits)</w:t>
+      </w:r>
+      <w:r>
+        <w:rPr>
+          <w:rFonts w:ascii="Arial" w:hAnsi="Arial" w:cs="Arial" w:eastAsiaTheme="minorEastAsia"/>
+          <w:bCs/>
+          <w:kern w:val="32"/>
+          <w:szCs w:val="32"/>
+          <w:lang w:val="en-US" w:eastAsia="zh-CN" w:bidi="ar-SA"/>
+        </w:rPr>
+        <w:tab/>
+      </w:r>
+      <w:r>
+        <w:rPr>
+          <w:rFonts w:ascii="Arial" w:hAnsi="Arial" w:cs="Arial" w:eastAsiaTheme="minorEastAsia"/>
+          <w:bCs/>
+          <w:kern w:val="32"/>
+          <w:szCs w:val="32"/>
+          <w:lang w:val="en-US" w:eastAsia="zh-CN" w:bidi="ar-SA"/>
+        </w:rPr>
+        <w:fldChar w:fldCharType="begin"/>
+      </w:r>
+      <w:r>
+        <w:rPr>
+          <w:rFonts w:ascii="Arial" w:hAnsi="Arial" w:cs="Arial" w:eastAsiaTheme="minorEastAsia"/>
+          <w:bCs/>
+          <w:kern w:val="32"/>
+          <w:szCs w:val="32"/>
+          <w:lang w:val="en-US" w:eastAsia="zh-CN" w:bidi="ar-SA"/>
+        </w:rPr>
+        <w:instrText xml:space="preserve"> PAGEREF _Toc3831 </w:instrText>
+      </w:r>
+      <w:r>
+        <w:rPr>
+          <w:rFonts w:ascii="Arial" w:hAnsi="Arial" w:cs="Arial" w:eastAsiaTheme="minorEastAsia"/>
+          <w:bCs/>
+          <w:kern w:val="32"/>
+          <w:szCs w:val="32"/>
+          <w:lang w:val="en-US" w:eastAsia="zh-CN" w:bidi="ar-SA"/>
+        </w:rPr>
+        <w:fldChar w:fldCharType="separate"/>
+      </w:r>
+      <w:r>
+        <w:rPr>
+          <w:rFonts w:ascii="Arial" w:hAnsi="Arial" w:cs="Arial" w:eastAsiaTheme="minorEastAsia"/>
+          <w:bCs/>
+          <w:kern w:val="32"/>
+          <w:szCs w:val="32"/>
+          <w:lang w:val="en-US" w:eastAsia="zh-CN" w:bidi="ar-SA"/>
+        </w:rPr>
+        <w:t>11</w:t>
+      </w:r>
+      <w:r>
+        <w:rPr>
+          <w:rFonts w:ascii="Arial" w:hAnsi="Arial" w:cs="Arial" w:eastAsiaTheme="minorEastAsia"/>
+          <w:bCs/>
+          <w:kern w:val="32"/>
+          <w:szCs w:val="32"/>
+          <w:lang w:val="en-US" w:eastAsia="zh-CN" w:bidi="ar-SA"/>
+        </w:rPr>
+        <w:fldChar w:fldCharType="end"/>
+      </w:r>
+      <w:r>
+        <w:rPr>
+          <w:rFonts w:hint="default" w:ascii="Arial" w:hAnsi="Arial" w:cs="Arial" w:eastAsiaTheme="minorEastAsia"/>
+          <w:bCs/>
+          <w:kern w:val="32"/>
+          <w:szCs w:val="32"/>
+          <w:lang w:val="en-US" w:eastAsia="zh-CN" w:bidi="ar-SA"/>
+        </w:rPr>
+        <w:fldChar w:fldCharType="end"/>
+      </w:r>
+    </w:p>
+    <w:p>
+      <w:pPr>
+        <w:pStyle w:val="10"/>
+        <w:tabs>
+          <w:tab w:val="right" w:leader="dot" w:pos="10466"/>
+        </w:tabs>
+        <w:rPr>
+          <w:rFonts w:ascii="Arial" w:hAnsi="Arial" w:cs="Arial" w:eastAsiaTheme="minorEastAsia"/>
+          <w:bCs/>
+          <w:kern w:val="32"/>
+          <w:szCs w:val="32"/>
+          <w:lang w:val="en-US" w:eastAsia="zh-CN" w:bidi="ar-SA"/>
+        </w:rPr>
+      </w:pPr>
+      <w:r>
+        <w:rPr>
+          <w:rFonts w:hint="default" w:ascii="Arial" w:hAnsi="Arial" w:cs="Arial" w:eastAsiaTheme="minorEastAsia"/>
+          <w:bCs/>
+          <w:kern w:val="32"/>
+          <w:szCs w:val="32"/>
+          <w:lang w:val="en-US" w:eastAsia="zh-CN" w:bidi="ar-SA"/>
+        </w:rPr>
+        <w:fldChar w:fldCharType="begin"/>
+      </w:r>
+      <w:r>
+        <w:rPr>
+          <w:rFonts w:hint="default" w:ascii="Arial" w:hAnsi="Arial" w:cs="Arial" w:eastAsiaTheme="minorEastAsia"/>
+          <w:bCs/>
+          <w:kern w:val="32"/>
+          <w:szCs w:val="32"/>
+          <w:lang w:val="en-US" w:eastAsia="zh-CN" w:bidi="ar-SA"/>
+        </w:rPr>
+        <w:instrText xml:space="preserve"> HYPERLINK \l _Toc13979 </w:instrText>
+      </w:r>
+      <w:r>
+        <w:rPr>
+          <w:rFonts w:hint="default" w:ascii="Arial" w:hAnsi="Arial" w:cs="Arial" w:eastAsiaTheme="minorEastAsia"/>
+          <w:bCs/>
+          <w:kern w:val="32"/>
+          <w:szCs w:val="32"/>
+          <w:lang w:val="en-US" w:eastAsia="zh-CN" w:bidi="ar-SA"/>
+        </w:rPr>
+        <w:fldChar w:fldCharType="separate"/>
+      </w:r>
+      <w:r>
+        <w:rPr>
+          <w:rFonts w:hint="default" w:ascii="Arial" w:hAnsi="Arial" w:cs="Arial" w:eastAsiaTheme="minorEastAsia"/>
+          <w:bCs/>
+          <w:kern w:val="32"/>
+          <w:szCs w:val="32"/>
+          <w:lang w:val="en-US" w:eastAsia="zh-CN" w:bidi="ar-SA"/>
+        </w:rPr>
+        <w:t>Условия для ожиданий</w:t>
+      </w:r>
+      <w:r>
+        <w:rPr>
+          <w:rFonts w:ascii="Arial" w:hAnsi="Arial" w:cs="Arial" w:eastAsiaTheme="minorEastAsia"/>
+          <w:bCs/>
+          <w:kern w:val="32"/>
+          <w:szCs w:val="32"/>
+          <w:lang w:val="en-US" w:eastAsia="zh-CN" w:bidi="ar-SA"/>
+        </w:rPr>
+        <w:tab/>
+      </w:r>
+      <w:r>
+        <w:rPr>
+          <w:rFonts w:ascii="Arial" w:hAnsi="Arial" w:cs="Arial" w:eastAsiaTheme="minorEastAsia"/>
+          <w:bCs/>
+          <w:kern w:val="32"/>
+          <w:szCs w:val="32"/>
+          <w:lang w:val="en-US" w:eastAsia="zh-CN" w:bidi="ar-SA"/>
+        </w:rPr>
+        <w:fldChar w:fldCharType="begin"/>
+      </w:r>
+      <w:r>
+        <w:rPr>
+          <w:rFonts w:ascii="Arial" w:hAnsi="Arial" w:cs="Arial" w:eastAsiaTheme="minorEastAsia"/>
+          <w:bCs/>
+          <w:kern w:val="32"/>
+          <w:szCs w:val="32"/>
+          <w:lang w:val="en-US" w:eastAsia="zh-CN" w:bidi="ar-SA"/>
+        </w:rPr>
+        <w:instrText xml:space="preserve"> PAGEREF _Toc13979 </w:instrText>
+      </w:r>
+      <w:r>
+        <w:rPr>
+          <w:rFonts w:ascii="Arial" w:hAnsi="Arial" w:cs="Arial" w:eastAsiaTheme="minorEastAsia"/>
+          <w:bCs/>
+          <w:kern w:val="32"/>
+          <w:szCs w:val="32"/>
+          <w:lang w:val="en-US" w:eastAsia="zh-CN" w:bidi="ar-SA"/>
+        </w:rPr>
+        <w:fldChar w:fldCharType="separate"/>
+      </w:r>
+      <w:r>
+        <w:rPr>
+          <w:rFonts w:ascii="Arial" w:hAnsi="Arial" w:cs="Arial" w:eastAsiaTheme="minorEastAsia"/>
+          <w:bCs/>
+          <w:kern w:val="32"/>
+          <w:szCs w:val="32"/>
+          <w:lang w:val="en-US" w:eastAsia="zh-CN" w:bidi="ar-SA"/>
+        </w:rPr>
+        <w:t>11</w:t>
+      </w:r>
+      <w:r>
+        <w:rPr>
+          <w:rFonts w:ascii="Arial" w:hAnsi="Arial" w:cs="Arial" w:eastAsiaTheme="minorEastAsia"/>
+          <w:bCs/>
+          <w:kern w:val="32"/>
+          <w:szCs w:val="32"/>
+          <w:lang w:val="en-US" w:eastAsia="zh-CN" w:bidi="ar-SA"/>
+        </w:rPr>
+        <w:fldChar w:fldCharType="end"/>
+      </w:r>
+      <w:r>
+        <w:rPr>
+          <w:rFonts w:hint="default" w:ascii="Arial" w:hAnsi="Arial" w:cs="Arial" w:eastAsiaTheme="minorEastAsia"/>
+          <w:bCs/>
+          <w:kern w:val="32"/>
+          <w:szCs w:val="32"/>
+          <w:lang w:val="en-US" w:eastAsia="zh-CN" w:bidi="ar-SA"/>
+        </w:rPr>
+        <w:fldChar w:fldCharType="end"/>
+      </w:r>
+    </w:p>
+    <w:p>
+      <w:pPr>
+        <w:pStyle w:val="10"/>
+        <w:tabs>
+          <w:tab w:val="right" w:leader="dot" w:pos="10466"/>
+        </w:tabs>
+        <w:rPr>
+          <w:rFonts w:ascii="Arial" w:hAnsi="Arial" w:cs="Arial" w:eastAsiaTheme="minorEastAsia"/>
+          <w:bCs/>
+          <w:kern w:val="32"/>
+          <w:szCs w:val="32"/>
+          <w:lang w:val="en-US" w:eastAsia="zh-CN" w:bidi="ar-SA"/>
+        </w:rPr>
+      </w:pPr>
+      <w:r>
+        <w:rPr>
+          <w:rFonts w:hint="default" w:ascii="Arial" w:hAnsi="Arial" w:cs="Arial" w:eastAsiaTheme="minorEastAsia"/>
+          <w:bCs/>
+          <w:kern w:val="32"/>
+          <w:szCs w:val="32"/>
+          <w:lang w:val="en-US" w:eastAsia="zh-CN" w:bidi="ar-SA"/>
+        </w:rPr>
+        <w:fldChar w:fldCharType="begin"/>
+      </w:r>
+      <w:r>
+        <w:rPr>
+          <w:rFonts w:hint="default" w:ascii="Arial" w:hAnsi="Arial" w:cs="Arial" w:eastAsiaTheme="minorEastAsia"/>
+          <w:bCs/>
+          <w:kern w:val="32"/>
+          <w:szCs w:val="32"/>
+          <w:lang w:val="en-US" w:eastAsia="zh-CN" w:bidi="ar-SA"/>
+        </w:rPr>
+        <w:instrText xml:space="preserve"> HYPERLINK \l _Toc14563 </w:instrText>
+      </w:r>
+      <w:r>
+        <w:rPr>
+          <w:rFonts w:hint="default" w:ascii="Arial" w:hAnsi="Arial" w:cs="Arial" w:eastAsiaTheme="minorEastAsia"/>
+          <w:bCs/>
+          <w:kern w:val="32"/>
+          <w:szCs w:val="32"/>
+          <w:lang w:val="en-US" w:eastAsia="zh-CN" w:bidi="ar-SA"/>
+        </w:rPr>
+        <w:fldChar w:fldCharType="separate"/>
+      </w:r>
+      <w:r>
+        <w:rPr>
+          <w:rFonts w:hint="default" w:ascii="Arial" w:hAnsi="Arial" w:cs="Arial" w:eastAsiaTheme="minorEastAsia"/>
+          <w:bCs/>
+          <w:kern w:val="32"/>
+          <w:szCs w:val="32"/>
+          <w:lang w:val="en-US" w:eastAsia="zh-CN" w:bidi="ar-SA"/>
+        </w:rPr>
+        <w:t>Пример: Тестирование AJAX-загрузки</w:t>
+      </w:r>
+      <w:r>
+        <w:rPr>
+          <w:rFonts w:ascii="Arial" w:hAnsi="Arial" w:cs="Arial" w:eastAsiaTheme="minorEastAsia"/>
+          <w:bCs/>
+          <w:kern w:val="32"/>
+          <w:szCs w:val="32"/>
+          <w:lang w:val="en-US" w:eastAsia="zh-CN" w:bidi="ar-SA"/>
+        </w:rPr>
+        <w:tab/>
+      </w:r>
+      <w:r>
+        <w:rPr>
+          <w:rFonts w:ascii="Arial" w:hAnsi="Arial" w:cs="Arial" w:eastAsiaTheme="minorEastAsia"/>
+          <w:bCs/>
+          <w:kern w:val="32"/>
+          <w:szCs w:val="32"/>
+          <w:lang w:val="en-US" w:eastAsia="zh-CN" w:bidi="ar-SA"/>
+        </w:rPr>
+        <w:fldChar w:fldCharType="begin"/>
+      </w:r>
+      <w:r>
+        <w:rPr>
+          <w:rFonts w:ascii="Arial" w:hAnsi="Arial" w:cs="Arial" w:eastAsiaTheme="minorEastAsia"/>
+          <w:bCs/>
+          <w:kern w:val="32"/>
+          <w:szCs w:val="32"/>
+          <w:lang w:val="en-US" w:eastAsia="zh-CN" w:bidi="ar-SA"/>
+        </w:rPr>
+        <w:instrText xml:space="preserve"> PAGEREF _Toc14563 </w:instrText>
+      </w:r>
+      <w:r>
+        <w:rPr>
+          <w:rFonts w:ascii="Arial" w:hAnsi="Arial" w:cs="Arial" w:eastAsiaTheme="minorEastAsia"/>
+          <w:bCs/>
+          <w:kern w:val="32"/>
+          <w:szCs w:val="32"/>
+          <w:lang w:val="en-US" w:eastAsia="zh-CN" w:bidi="ar-SA"/>
+        </w:rPr>
+        <w:fldChar w:fldCharType="separate"/>
+      </w:r>
+      <w:r>
+        <w:rPr>
+          <w:rFonts w:ascii="Arial" w:hAnsi="Arial" w:cs="Arial" w:eastAsiaTheme="minorEastAsia"/>
+          <w:bCs/>
+          <w:kern w:val="32"/>
+          <w:szCs w:val="32"/>
+          <w:lang w:val="en-US" w:eastAsia="zh-CN" w:bidi="ar-SA"/>
+        </w:rPr>
+        <w:t>12</w:t>
+      </w:r>
+      <w:r>
+        <w:rPr>
+          <w:rFonts w:ascii="Arial" w:hAnsi="Arial" w:cs="Arial" w:eastAsiaTheme="minorEastAsia"/>
+          <w:bCs/>
+          <w:kern w:val="32"/>
+          <w:szCs w:val="32"/>
+          <w:lang w:val="en-US" w:eastAsia="zh-CN" w:bidi="ar-SA"/>
+        </w:rPr>
+        <w:fldChar w:fldCharType="end"/>
+      </w:r>
+      <w:r>
+        <w:rPr>
+          <w:rFonts w:hint="default" w:ascii="Arial" w:hAnsi="Arial" w:cs="Arial" w:eastAsiaTheme="minorEastAsia"/>
+          <w:bCs/>
+          <w:kern w:val="32"/>
+          <w:szCs w:val="32"/>
+          <w:lang w:val="en-US" w:eastAsia="zh-CN" w:bidi="ar-SA"/>
+        </w:rPr>
+        <w:fldChar w:fldCharType="end"/>
+      </w:r>
+    </w:p>
+    <w:p>
+      <w:pPr>
+        <w:pStyle w:val="10"/>
+        <w:tabs>
+          <w:tab w:val="right" w:leader="dot" w:pos="10466"/>
+        </w:tabs>
+        <w:rPr>
+          <w:rFonts w:ascii="Arial" w:hAnsi="Arial" w:cs="Arial" w:eastAsiaTheme="minorEastAsia"/>
+          <w:bCs/>
+          <w:kern w:val="32"/>
+          <w:szCs w:val="32"/>
+          <w:lang w:val="en-US" w:eastAsia="zh-CN" w:bidi="ar-SA"/>
+        </w:rPr>
+      </w:pPr>
+      <w:r>
+        <w:rPr>
+          <w:rFonts w:hint="default" w:ascii="Arial" w:hAnsi="Arial" w:cs="Arial" w:eastAsiaTheme="minorEastAsia"/>
+          <w:bCs/>
+          <w:kern w:val="32"/>
+          <w:szCs w:val="32"/>
+          <w:lang w:val="en-US" w:eastAsia="zh-CN" w:bidi="ar-SA"/>
+        </w:rPr>
+        <w:fldChar w:fldCharType="begin"/>
+      </w:r>
+      <w:r>
+        <w:rPr>
+          <w:rFonts w:hint="default" w:ascii="Arial" w:hAnsi="Arial" w:cs="Arial" w:eastAsiaTheme="minorEastAsia"/>
+          <w:bCs/>
+          <w:kern w:val="32"/>
+          <w:szCs w:val="32"/>
+          <w:lang w:val="en-US" w:eastAsia="zh-CN" w:bidi="ar-SA"/>
+        </w:rPr>
+        <w:instrText xml:space="preserve"> HYPERLINK \l _Toc20450 </w:instrText>
+      </w:r>
+      <w:r>
+        <w:rPr>
+          <w:rFonts w:hint="default" w:ascii="Arial" w:hAnsi="Arial" w:cs="Arial" w:eastAsiaTheme="minorEastAsia"/>
+          <w:bCs/>
+          <w:kern w:val="32"/>
+          <w:szCs w:val="32"/>
+          <w:lang w:val="en-US" w:eastAsia="zh-CN" w:bidi="ar-SA"/>
+        </w:rPr>
+        <w:fldChar w:fldCharType="separate"/>
+      </w:r>
+      <w:r>
+        <w:rPr>
+          <w:rFonts w:hint="default" w:ascii="Arial" w:hAnsi="Arial" w:cs="Arial" w:eastAsiaTheme="minorEastAsia"/>
+          <w:bCs/>
+          <w:kern w:val="32"/>
+          <w:szCs w:val="32"/>
+          <w:lang w:val="en-US" w:eastAsia="zh-CN" w:bidi="ar-SA"/>
+        </w:rPr>
+        <w:t>Частые ошибки и их решение</w:t>
+      </w:r>
+      <w:r>
+        <w:rPr>
+          <w:rFonts w:ascii="Arial" w:hAnsi="Arial" w:cs="Arial" w:eastAsiaTheme="minorEastAsia"/>
+          <w:bCs/>
+          <w:kern w:val="32"/>
+          <w:szCs w:val="32"/>
+          <w:lang w:val="en-US" w:eastAsia="zh-CN" w:bidi="ar-SA"/>
+        </w:rPr>
+        <w:tab/>
+      </w:r>
+      <w:r>
+        <w:rPr>
+          <w:rFonts w:ascii="Arial" w:hAnsi="Arial" w:cs="Arial" w:eastAsiaTheme="minorEastAsia"/>
+          <w:bCs/>
+          <w:kern w:val="32"/>
+          <w:szCs w:val="32"/>
+          <w:lang w:val="en-US" w:eastAsia="zh-CN" w:bidi="ar-SA"/>
+        </w:rPr>
+        <w:fldChar w:fldCharType="begin"/>
+      </w:r>
+      <w:r>
+        <w:rPr>
+          <w:rFonts w:ascii="Arial" w:hAnsi="Arial" w:cs="Arial" w:eastAsiaTheme="minorEastAsia"/>
+          <w:bCs/>
+          <w:kern w:val="32"/>
+          <w:szCs w:val="32"/>
+          <w:lang w:val="en-US" w:eastAsia="zh-CN" w:bidi="ar-SA"/>
+        </w:rPr>
+        <w:instrText xml:space="preserve"> PAGEREF _Toc20450 </w:instrText>
+      </w:r>
+      <w:r>
+        <w:rPr>
+          <w:rFonts w:ascii="Arial" w:hAnsi="Arial" w:cs="Arial" w:eastAsiaTheme="minorEastAsia"/>
+          <w:bCs/>
+          <w:kern w:val="32"/>
+          <w:szCs w:val="32"/>
+          <w:lang w:val="en-US" w:eastAsia="zh-CN" w:bidi="ar-SA"/>
+        </w:rPr>
+        <w:fldChar w:fldCharType="separate"/>
+      </w:r>
+      <w:r>
+        <w:rPr>
+          <w:rFonts w:ascii="Arial" w:hAnsi="Arial" w:cs="Arial" w:eastAsiaTheme="minorEastAsia"/>
+          <w:bCs/>
+          <w:kern w:val="32"/>
+          <w:szCs w:val="32"/>
+          <w:lang w:val="en-US" w:eastAsia="zh-CN" w:bidi="ar-SA"/>
+        </w:rPr>
+        <w:t>12</w:t>
+      </w:r>
+      <w:r>
+        <w:rPr>
+          <w:rFonts w:ascii="Arial" w:hAnsi="Arial" w:cs="Arial" w:eastAsiaTheme="minorEastAsia"/>
+          <w:bCs/>
+          <w:kern w:val="32"/>
+          <w:szCs w:val="32"/>
+          <w:lang w:val="en-US" w:eastAsia="zh-CN" w:bidi="ar-SA"/>
+        </w:rPr>
+        <w:fldChar w:fldCharType="end"/>
+      </w:r>
+      <w:r>
+        <w:rPr>
+          <w:rFonts w:hint="default" w:ascii="Arial" w:hAnsi="Arial" w:cs="Arial" w:eastAsiaTheme="minorEastAsia"/>
+          <w:bCs/>
+          <w:kern w:val="32"/>
+          <w:szCs w:val="32"/>
+          <w:lang w:val="en-US" w:eastAsia="zh-CN" w:bidi="ar-SA"/>
+        </w:rPr>
+        <w:fldChar w:fldCharType="end"/>
+      </w:r>
+    </w:p>
+    <w:p>
+      <w:pPr>
+        <w:pStyle w:val="10"/>
+        <w:tabs>
+          <w:tab w:val="right" w:leader="dot" w:pos="10466"/>
+        </w:tabs>
+        <w:rPr>
+          <w:rFonts w:ascii="Arial" w:hAnsi="Arial" w:cs="Arial" w:eastAsiaTheme="minorEastAsia"/>
+          <w:bCs/>
+          <w:kern w:val="32"/>
+          <w:szCs w:val="32"/>
+          <w:lang w:val="en-US" w:eastAsia="zh-CN" w:bidi="ar-SA"/>
+        </w:rPr>
+      </w:pPr>
+      <w:r>
+        <w:rPr>
+          <w:rFonts w:hint="default" w:ascii="Arial" w:hAnsi="Arial" w:cs="Arial" w:eastAsiaTheme="minorEastAsia"/>
+          <w:bCs/>
+          <w:kern w:val="32"/>
+          <w:szCs w:val="32"/>
+          <w:lang w:val="en-US" w:eastAsia="zh-CN" w:bidi="ar-SA"/>
+        </w:rPr>
+        <w:fldChar w:fldCharType="begin"/>
+      </w:r>
+      <w:r>
+        <w:rPr>
+          <w:rFonts w:hint="default" w:ascii="Arial" w:hAnsi="Arial" w:cs="Arial" w:eastAsiaTheme="minorEastAsia"/>
+          <w:bCs/>
+          <w:kern w:val="32"/>
+          <w:szCs w:val="32"/>
+          <w:lang w:val="en-US" w:eastAsia="zh-CN" w:bidi="ar-SA"/>
+        </w:rPr>
+        <w:instrText xml:space="preserve"> HYPERLINK \l _Toc21780 </w:instrText>
+      </w:r>
+      <w:r>
+        <w:rPr>
+          <w:rFonts w:hint="default" w:ascii="Arial" w:hAnsi="Arial" w:cs="Arial" w:eastAsiaTheme="minorEastAsia"/>
+          <w:bCs/>
+          <w:kern w:val="32"/>
+          <w:szCs w:val="32"/>
+          <w:lang w:val="en-US" w:eastAsia="zh-CN" w:bidi="ar-SA"/>
+        </w:rPr>
+        <w:fldChar w:fldCharType="separate"/>
+      </w:r>
+      <w:r>
+        <w:rPr>
+          <w:rFonts w:hint="default" w:ascii="Arial" w:hAnsi="Arial" w:cs="Arial" w:eastAsiaTheme="minorEastAsia"/>
+          <w:bCs/>
+          <w:kern w:val="32"/>
+          <w:szCs w:val="32"/>
+          <w:lang w:val="en-US" w:eastAsia="zh-CN" w:bidi="ar-SA"/>
+        </w:rPr>
+        <w:t>Дополнительные советы</w:t>
+      </w:r>
+      <w:r>
+        <w:rPr>
+          <w:rFonts w:ascii="Arial" w:hAnsi="Arial" w:cs="Arial" w:eastAsiaTheme="minorEastAsia"/>
+          <w:bCs/>
+          <w:kern w:val="32"/>
+          <w:szCs w:val="32"/>
+          <w:lang w:val="en-US" w:eastAsia="zh-CN" w:bidi="ar-SA"/>
+        </w:rPr>
+        <w:tab/>
+      </w:r>
+      <w:r>
+        <w:rPr>
+          <w:rFonts w:ascii="Arial" w:hAnsi="Arial" w:cs="Arial" w:eastAsiaTheme="minorEastAsia"/>
+          <w:bCs/>
+          <w:kern w:val="32"/>
+          <w:szCs w:val="32"/>
+          <w:lang w:val="en-US" w:eastAsia="zh-CN" w:bidi="ar-SA"/>
+        </w:rPr>
+        <w:fldChar w:fldCharType="begin"/>
+      </w:r>
+      <w:r>
+        <w:rPr>
+          <w:rFonts w:ascii="Arial" w:hAnsi="Arial" w:cs="Arial" w:eastAsiaTheme="minorEastAsia"/>
+          <w:bCs/>
+          <w:kern w:val="32"/>
+          <w:szCs w:val="32"/>
+          <w:lang w:val="en-US" w:eastAsia="zh-CN" w:bidi="ar-SA"/>
+        </w:rPr>
+        <w:instrText xml:space="preserve"> PAGEREF _Toc21780 </w:instrText>
+      </w:r>
+      <w:r>
+        <w:rPr>
+          <w:rFonts w:ascii="Arial" w:hAnsi="Arial" w:cs="Arial" w:eastAsiaTheme="minorEastAsia"/>
+          <w:bCs/>
+          <w:kern w:val="32"/>
+          <w:szCs w:val="32"/>
+          <w:lang w:val="en-US" w:eastAsia="zh-CN" w:bidi="ar-SA"/>
+        </w:rPr>
+        <w:fldChar w:fldCharType="separate"/>
+      </w:r>
+      <w:r>
+        <w:rPr>
+          <w:rFonts w:ascii="Arial" w:hAnsi="Arial" w:cs="Arial" w:eastAsiaTheme="minorEastAsia"/>
+          <w:bCs/>
+          <w:kern w:val="32"/>
+          <w:szCs w:val="32"/>
+          <w:lang w:val="en-US" w:eastAsia="zh-CN" w:bidi="ar-SA"/>
+        </w:rPr>
+        <w:t>12</w:t>
+      </w:r>
+      <w:r>
+        <w:rPr>
+          <w:rFonts w:ascii="Arial" w:hAnsi="Arial" w:cs="Arial" w:eastAsiaTheme="minorEastAsia"/>
+          <w:bCs/>
+          <w:kern w:val="32"/>
+          <w:szCs w:val="32"/>
+          <w:lang w:val="en-US" w:eastAsia="zh-CN" w:bidi="ar-SA"/>
+        </w:rPr>
+        <w:fldChar w:fldCharType="end"/>
+      </w:r>
+      <w:r>
+        <w:rPr>
+          <w:rFonts w:hint="default" w:ascii="Arial" w:hAnsi="Arial" w:cs="Arial" w:eastAsiaTheme="minorEastAsia"/>
+          <w:bCs/>
+          <w:kern w:val="32"/>
+          <w:szCs w:val="32"/>
+          <w:lang w:val="en-US" w:eastAsia="zh-CN" w:bidi="ar-SA"/>
+        </w:rPr>
+        <w:fldChar w:fldCharType="end"/>
+      </w:r>
+    </w:p>
+    <w:p>
+      <w:pPr>
+        <w:pStyle w:val="7"/>
+        <w:tabs>
+          <w:tab w:val="right" w:leader="dot" w:pos="10466"/>
+        </w:tabs>
+        <w:rPr>
+          <w:rFonts w:ascii="Arial" w:hAnsi="Arial" w:cs="Arial" w:eastAsiaTheme="minorEastAsia"/>
+          <w:bCs/>
+          <w:kern w:val="32"/>
+          <w:szCs w:val="32"/>
+          <w:lang w:val="en-US" w:eastAsia="zh-CN" w:bidi="ar-SA"/>
+        </w:rPr>
+      </w:pPr>
+      <w:r>
+        <w:rPr>
+          <w:rFonts w:hint="default" w:ascii="Arial" w:hAnsi="Arial" w:cs="Arial" w:eastAsiaTheme="minorEastAsia"/>
+          <w:bCs/>
+          <w:kern w:val="32"/>
+          <w:szCs w:val="32"/>
+          <w:lang w:val="en-US" w:eastAsia="zh-CN" w:bidi="ar-SA"/>
+        </w:rPr>
+        <w:fldChar w:fldCharType="begin"/>
+      </w:r>
+      <w:r>
+        <w:rPr>
+          <w:rFonts w:hint="default" w:ascii="Arial" w:hAnsi="Arial" w:cs="Arial" w:eastAsiaTheme="minorEastAsia"/>
+          <w:bCs/>
+          <w:kern w:val="32"/>
+          <w:szCs w:val="32"/>
+          <w:lang w:val="en-US" w:eastAsia="zh-CN" w:bidi="ar-SA"/>
+        </w:rPr>
+        <w:instrText xml:space="preserve"> HYPERLINK \l _Toc15324 </w:instrText>
+      </w:r>
+      <w:r>
+        <w:rPr>
+          <w:rFonts w:hint="default" w:ascii="Arial" w:hAnsi="Arial" w:cs="Arial" w:eastAsiaTheme="minorEastAsia"/>
+          <w:bCs/>
+          <w:kern w:val="32"/>
+          <w:szCs w:val="32"/>
+          <w:lang w:val="en-US" w:eastAsia="zh-CN" w:bidi="ar-SA"/>
+        </w:rPr>
+        <w:fldChar w:fldCharType="separate"/>
+      </w:r>
+      <w:r>
+        <w:rPr>
+          <w:rFonts w:hint="default" w:ascii="Arial" w:hAnsi="Arial" w:cs="Arial" w:eastAsiaTheme="minorEastAsia"/>
+          <w:bCs/>
+          <w:kern w:val="32"/>
+          <w:szCs w:val="32"/>
+          <w:lang w:val="en-US" w:eastAsia="zh-CN" w:bidi="ar-SA"/>
+        </w:rPr>
+        <w:t>6.1 Настройка автоматического запуска тестов</w:t>
+      </w:r>
+      <w:r>
+        <w:rPr>
+          <w:rFonts w:ascii="Arial" w:hAnsi="Arial" w:cs="Arial" w:eastAsiaTheme="minorEastAsia"/>
+          <w:bCs/>
+          <w:kern w:val="32"/>
+          <w:szCs w:val="32"/>
+          <w:lang w:val="en-US" w:eastAsia="zh-CN" w:bidi="ar-SA"/>
+        </w:rPr>
+        <w:tab/>
+      </w:r>
+      <w:r>
+        <w:rPr>
+          <w:rFonts w:ascii="Arial" w:hAnsi="Arial" w:cs="Arial" w:eastAsiaTheme="minorEastAsia"/>
+          <w:bCs/>
+          <w:kern w:val="32"/>
+          <w:szCs w:val="32"/>
+          <w:lang w:val="en-US" w:eastAsia="zh-CN" w:bidi="ar-SA"/>
+        </w:rPr>
+        <w:fldChar w:fldCharType="begin"/>
+      </w:r>
+      <w:r>
+        <w:rPr>
+          <w:rFonts w:ascii="Arial" w:hAnsi="Arial" w:cs="Arial" w:eastAsiaTheme="minorEastAsia"/>
+          <w:bCs/>
+          <w:kern w:val="32"/>
+          <w:szCs w:val="32"/>
+          <w:lang w:val="en-US" w:eastAsia="zh-CN" w:bidi="ar-SA"/>
+        </w:rPr>
+        <w:instrText xml:space="preserve"> PAGEREF _Toc15324 </w:instrText>
+      </w:r>
+      <w:r>
+        <w:rPr>
+          <w:rFonts w:ascii="Arial" w:hAnsi="Arial" w:cs="Arial" w:eastAsiaTheme="minorEastAsia"/>
+          <w:bCs/>
+          <w:kern w:val="32"/>
+          <w:szCs w:val="32"/>
+          <w:lang w:val="en-US" w:eastAsia="zh-CN" w:bidi="ar-SA"/>
+        </w:rPr>
+        <w:fldChar w:fldCharType="separate"/>
+      </w:r>
+      <w:r>
+        <w:rPr>
+          <w:rFonts w:ascii="Arial" w:hAnsi="Arial" w:cs="Arial" w:eastAsiaTheme="minorEastAsia"/>
+          <w:bCs/>
+          <w:kern w:val="32"/>
+          <w:szCs w:val="32"/>
+          <w:lang w:val="en-US" w:eastAsia="zh-CN" w:bidi="ar-SA"/>
+        </w:rPr>
+        <w:t>13</w:t>
+      </w:r>
+      <w:r>
+        <w:rPr>
+          <w:rFonts w:ascii="Arial" w:hAnsi="Arial" w:cs="Arial" w:eastAsiaTheme="minorEastAsia"/>
+          <w:bCs/>
+          <w:kern w:val="32"/>
+          <w:szCs w:val="32"/>
+          <w:lang w:val="en-US" w:eastAsia="zh-CN" w:bidi="ar-SA"/>
+        </w:rPr>
+        <w:fldChar w:fldCharType="end"/>
+      </w:r>
+      <w:r>
+        <w:rPr>
+          <w:rFonts w:hint="default" w:ascii="Arial" w:hAnsi="Arial" w:cs="Arial" w:eastAsiaTheme="minorEastAsia"/>
+          <w:bCs/>
+          <w:kern w:val="32"/>
+          <w:szCs w:val="32"/>
+          <w:lang w:val="en-US" w:eastAsia="zh-CN" w:bidi="ar-SA"/>
+        </w:rPr>
+        <w:fldChar w:fldCharType="end"/>
+      </w:r>
+    </w:p>
+    <w:p>
+      <w:pPr>
+        <w:pStyle w:val="10"/>
+        <w:tabs>
+          <w:tab w:val="right" w:leader="dot" w:pos="10466"/>
+        </w:tabs>
+        <w:rPr>
+          <w:rFonts w:ascii="Arial" w:hAnsi="Arial" w:cs="Arial" w:eastAsiaTheme="minorEastAsia"/>
+          <w:bCs/>
+          <w:kern w:val="32"/>
+          <w:szCs w:val="32"/>
+          <w:lang w:val="en-US" w:eastAsia="zh-CN" w:bidi="ar-SA"/>
+        </w:rPr>
+      </w:pPr>
+      <w:r>
+        <w:rPr>
+          <w:rFonts w:hint="default" w:ascii="Arial" w:hAnsi="Arial" w:cs="Arial" w:eastAsiaTheme="minorEastAsia"/>
+          <w:bCs/>
+          <w:kern w:val="32"/>
+          <w:szCs w:val="32"/>
+          <w:lang w:val="en-US" w:eastAsia="zh-CN" w:bidi="ar-SA"/>
+        </w:rPr>
+        <w:fldChar w:fldCharType="begin"/>
+      </w:r>
+      <w:r>
+        <w:rPr>
+          <w:rFonts w:hint="default" w:ascii="Arial" w:hAnsi="Arial" w:cs="Arial" w:eastAsiaTheme="minorEastAsia"/>
+          <w:bCs/>
+          <w:kern w:val="32"/>
+          <w:szCs w:val="32"/>
+          <w:lang w:val="en-US" w:eastAsia="zh-CN" w:bidi="ar-SA"/>
+        </w:rPr>
+        <w:instrText xml:space="preserve"> HYPERLINK \l _Toc26008 </w:instrText>
+      </w:r>
+      <w:r>
+        <w:rPr>
+          <w:rFonts w:hint="default" w:ascii="Arial" w:hAnsi="Arial" w:cs="Arial" w:eastAsiaTheme="minorEastAsia"/>
+          <w:bCs/>
+          <w:kern w:val="32"/>
+          <w:szCs w:val="32"/>
+          <w:lang w:val="en-US" w:eastAsia="zh-CN" w:bidi="ar-SA"/>
+        </w:rPr>
+        <w:fldChar w:fldCharType="separate"/>
+      </w:r>
+      <w:r>
+        <w:rPr>
+          <w:rFonts w:hint="default" w:ascii="Arial" w:hAnsi="Arial" w:cs="Arial" w:eastAsiaTheme="minorEastAsia"/>
+          <w:bCs/>
+          <w:kern w:val="32"/>
+          <w:szCs w:val="32"/>
+          <w:lang w:val="en-US" w:eastAsia="zh-CN" w:bidi="ar-SA"/>
+        </w:rPr>
+        <w:t>Что такое CI/CD?</w:t>
+      </w:r>
+      <w:r>
+        <w:rPr>
+          <w:rFonts w:ascii="Arial" w:hAnsi="Arial" w:cs="Arial" w:eastAsiaTheme="minorEastAsia"/>
+          <w:bCs/>
+          <w:kern w:val="32"/>
+          <w:szCs w:val="32"/>
+          <w:lang w:val="en-US" w:eastAsia="zh-CN" w:bidi="ar-SA"/>
+        </w:rPr>
+        <w:tab/>
+      </w:r>
+      <w:r>
+        <w:rPr>
+          <w:rFonts w:ascii="Arial" w:hAnsi="Arial" w:cs="Arial" w:eastAsiaTheme="minorEastAsia"/>
+          <w:bCs/>
+          <w:kern w:val="32"/>
+          <w:szCs w:val="32"/>
+          <w:lang w:val="en-US" w:eastAsia="zh-CN" w:bidi="ar-SA"/>
+        </w:rPr>
+        <w:fldChar w:fldCharType="begin"/>
+      </w:r>
+      <w:r>
+        <w:rPr>
+          <w:rFonts w:ascii="Arial" w:hAnsi="Arial" w:cs="Arial" w:eastAsiaTheme="minorEastAsia"/>
+          <w:bCs/>
+          <w:kern w:val="32"/>
+          <w:szCs w:val="32"/>
+          <w:lang w:val="en-US" w:eastAsia="zh-CN" w:bidi="ar-SA"/>
+        </w:rPr>
+        <w:instrText xml:space="preserve"> PAGEREF _Toc26008 </w:instrText>
+      </w:r>
+      <w:r>
+        <w:rPr>
+          <w:rFonts w:ascii="Arial" w:hAnsi="Arial" w:cs="Arial" w:eastAsiaTheme="minorEastAsia"/>
+          <w:bCs/>
+          <w:kern w:val="32"/>
+          <w:szCs w:val="32"/>
+          <w:lang w:val="en-US" w:eastAsia="zh-CN" w:bidi="ar-SA"/>
+        </w:rPr>
+        <w:fldChar w:fldCharType="separate"/>
+      </w:r>
+      <w:r>
+        <w:rPr>
+          <w:rFonts w:ascii="Arial" w:hAnsi="Arial" w:cs="Arial" w:eastAsiaTheme="minorEastAsia"/>
+          <w:bCs/>
+          <w:kern w:val="32"/>
+          <w:szCs w:val="32"/>
+          <w:lang w:val="en-US" w:eastAsia="zh-CN" w:bidi="ar-SA"/>
+        </w:rPr>
+        <w:t>13</w:t>
+      </w:r>
+      <w:r>
+        <w:rPr>
+          <w:rFonts w:ascii="Arial" w:hAnsi="Arial" w:cs="Arial" w:eastAsiaTheme="minorEastAsia"/>
+          <w:bCs/>
+          <w:kern w:val="32"/>
+          <w:szCs w:val="32"/>
+          <w:lang w:val="en-US" w:eastAsia="zh-CN" w:bidi="ar-SA"/>
+        </w:rPr>
+        <w:fldChar w:fldCharType="end"/>
+      </w:r>
+      <w:r>
+        <w:rPr>
+          <w:rFonts w:hint="default" w:ascii="Arial" w:hAnsi="Arial" w:cs="Arial" w:eastAsiaTheme="minorEastAsia"/>
+          <w:bCs/>
+          <w:kern w:val="32"/>
+          <w:szCs w:val="32"/>
+          <w:lang w:val="en-US" w:eastAsia="zh-CN" w:bidi="ar-SA"/>
+        </w:rPr>
+        <w:fldChar w:fldCharType="end"/>
+      </w:r>
+    </w:p>
+    <w:p>
+      <w:pPr>
+        <w:pStyle w:val="10"/>
+        <w:tabs>
+          <w:tab w:val="right" w:leader="dot" w:pos="10466"/>
+        </w:tabs>
+        <w:rPr>
+          <w:rFonts w:ascii="Arial" w:hAnsi="Arial" w:cs="Arial" w:eastAsiaTheme="minorEastAsia"/>
+          <w:bCs/>
+          <w:kern w:val="32"/>
+          <w:szCs w:val="32"/>
+          <w:lang w:val="en-US" w:eastAsia="zh-CN" w:bidi="ar-SA"/>
+        </w:rPr>
+      </w:pPr>
+      <w:r>
+        <w:rPr>
+          <w:rFonts w:hint="default" w:ascii="Arial" w:hAnsi="Arial" w:cs="Arial" w:eastAsiaTheme="minorEastAsia"/>
+          <w:bCs/>
+          <w:kern w:val="32"/>
+          <w:szCs w:val="32"/>
+          <w:lang w:val="en-US" w:eastAsia="zh-CN" w:bidi="ar-SA"/>
+        </w:rPr>
+        <w:fldChar w:fldCharType="begin"/>
+      </w:r>
+      <w:r>
+        <w:rPr>
+          <w:rFonts w:hint="default" w:ascii="Arial" w:hAnsi="Arial" w:cs="Arial" w:eastAsiaTheme="minorEastAsia"/>
+          <w:bCs/>
+          <w:kern w:val="32"/>
+          <w:szCs w:val="32"/>
+          <w:lang w:val="en-US" w:eastAsia="zh-CN" w:bidi="ar-SA"/>
+        </w:rPr>
+        <w:instrText xml:space="preserve"> HYPERLINK \l _Toc19097 </w:instrText>
+      </w:r>
+      <w:r>
+        <w:rPr>
+          <w:rFonts w:hint="default" w:ascii="Arial" w:hAnsi="Arial" w:cs="Arial" w:eastAsiaTheme="minorEastAsia"/>
+          <w:bCs/>
+          <w:kern w:val="32"/>
+          <w:szCs w:val="32"/>
+          <w:lang w:val="en-US" w:eastAsia="zh-CN" w:bidi="ar-SA"/>
+        </w:rPr>
+        <w:fldChar w:fldCharType="separate"/>
+      </w:r>
+      <w:r>
+        <w:rPr>
+          <w:rFonts w:hint="default" w:ascii="Arial" w:hAnsi="Arial" w:cs="Arial" w:eastAsiaTheme="minorEastAsia"/>
+          <w:bCs/>
+          <w:kern w:val="32"/>
+          <w:szCs w:val="32"/>
+          <w:lang w:val="en-US" w:eastAsia="zh-CN" w:bidi="ar-SA"/>
+        </w:rPr>
+        <w:t>Зачем интегрировать тесты в CI/CD</w:t>
+      </w:r>
+      <w:r>
+        <w:rPr>
+          <w:rFonts w:ascii="Arial" w:hAnsi="Arial" w:cs="Arial" w:eastAsiaTheme="minorEastAsia"/>
+          <w:bCs/>
+          <w:kern w:val="32"/>
+          <w:szCs w:val="32"/>
+          <w:lang w:val="en-US" w:eastAsia="zh-CN" w:bidi="ar-SA"/>
+        </w:rPr>
+        <w:tab/>
+      </w:r>
+      <w:r>
+        <w:rPr>
+          <w:rFonts w:ascii="Arial" w:hAnsi="Arial" w:cs="Arial" w:eastAsiaTheme="minorEastAsia"/>
+          <w:bCs/>
+          <w:kern w:val="32"/>
+          <w:szCs w:val="32"/>
+          <w:lang w:val="en-US" w:eastAsia="zh-CN" w:bidi="ar-SA"/>
+        </w:rPr>
+        <w:fldChar w:fldCharType="begin"/>
+      </w:r>
+      <w:r>
+        <w:rPr>
+          <w:rFonts w:ascii="Arial" w:hAnsi="Arial" w:cs="Arial" w:eastAsiaTheme="minorEastAsia"/>
+          <w:bCs/>
+          <w:kern w:val="32"/>
+          <w:szCs w:val="32"/>
+          <w:lang w:val="en-US" w:eastAsia="zh-CN" w:bidi="ar-SA"/>
+        </w:rPr>
+        <w:instrText xml:space="preserve"> PAGEREF _Toc19097 </w:instrText>
+      </w:r>
+      <w:r>
+        <w:rPr>
+          <w:rFonts w:ascii="Arial" w:hAnsi="Arial" w:cs="Arial" w:eastAsiaTheme="minorEastAsia"/>
+          <w:bCs/>
+          <w:kern w:val="32"/>
+          <w:szCs w:val="32"/>
+          <w:lang w:val="en-US" w:eastAsia="zh-CN" w:bidi="ar-SA"/>
+        </w:rPr>
+        <w:fldChar w:fldCharType="separate"/>
+      </w:r>
+      <w:r>
+        <w:rPr>
+          <w:rFonts w:ascii="Arial" w:hAnsi="Arial" w:cs="Arial" w:eastAsiaTheme="minorEastAsia"/>
+          <w:bCs/>
+          <w:kern w:val="32"/>
+          <w:szCs w:val="32"/>
+          <w:lang w:val="en-US" w:eastAsia="zh-CN" w:bidi="ar-SA"/>
+        </w:rPr>
+        <w:t>13</w:t>
+      </w:r>
+      <w:r>
+        <w:rPr>
+          <w:rFonts w:ascii="Arial" w:hAnsi="Arial" w:cs="Arial" w:eastAsiaTheme="minorEastAsia"/>
+          <w:bCs/>
+          <w:kern w:val="32"/>
+          <w:szCs w:val="32"/>
+          <w:lang w:val="en-US" w:eastAsia="zh-CN" w:bidi="ar-SA"/>
+        </w:rPr>
+        <w:fldChar w:fldCharType="end"/>
+      </w:r>
+      <w:r>
+        <w:rPr>
+          <w:rFonts w:hint="default" w:ascii="Arial" w:hAnsi="Arial" w:cs="Arial" w:eastAsiaTheme="minorEastAsia"/>
+          <w:bCs/>
+          <w:kern w:val="32"/>
+          <w:szCs w:val="32"/>
+          <w:lang w:val="en-US" w:eastAsia="zh-CN" w:bidi="ar-SA"/>
+        </w:rPr>
+        <w:fldChar w:fldCharType="end"/>
+      </w:r>
+    </w:p>
+    <w:p>
+      <w:pPr>
+        <w:pStyle w:val="10"/>
+        <w:tabs>
+          <w:tab w:val="right" w:leader="dot" w:pos="10466"/>
+        </w:tabs>
+        <w:rPr>
+          <w:rFonts w:ascii="Arial" w:hAnsi="Arial" w:cs="Arial" w:eastAsiaTheme="minorEastAsia"/>
+          <w:bCs/>
+          <w:kern w:val="32"/>
+          <w:szCs w:val="32"/>
+          <w:lang w:val="en-US" w:eastAsia="zh-CN" w:bidi="ar-SA"/>
+        </w:rPr>
+      </w:pPr>
+      <w:r>
+        <w:rPr>
+          <w:rFonts w:hint="default" w:ascii="Arial" w:hAnsi="Arial" w:cs="Arial" w:eastAsiaTheme="minorEastAsia"/>
+          <w:bCs/>
+          <w:kern w:val="32"/>
+          <w:szCs w:val="32"/>
+          <w:lang w:val="en-US" w:eastAsia="zh-CN" w:bidi="ar-SA"/>
+        </w:rPr>
+        <w:fldChar w:fldCharType="begin"/>
+      </w:r>
+      <w:r>
+        <w:rPr>
+          <w:rFonts w:hint="default" w:ascii="Arial" w:hAnsi="Arial" w:cs="Arial" w:eastAsiaTheme="minorEastAsia"/>
+          <w:bCs/>
+          <w:kern w:val="32"/>
+          <w:szCs w:val="32"/>
+          <w:lang w:val="en-US" w:eastAsia="zh-CN" w:bidi="ar-SA"/>
+        </w:rPr>
+        <w:instrText xml:space="preserve"> HYPERLINK \l _Toc16300 </w:instrText>
+      </w:r>
+      <w:r>
+        <w:rPr>
+          <w:rFonts w:hint="default" w:ascii="Arial" w:hAnsi="Arial" w:cs="Arial" w:eastAsiaTheme="minorEastAsia"/>
+          <w:bCs/>
+          <w:kern w:val="32"/>
+          <w:szCs w:val="32"/>
+          <w:lang w:val="en-US" w:eastAsia="zh-CN" w:bidi="ar-SA"/>
+        </w:rPr>
+        <w:fldChar w:fldCharType="separate"/>
+      </w:r>
+      <w:r>
+        <w:rPr>
+          <w:rFonts w:hint="default" w:ascii="Arial" w:hAnsi="Arial" w:cs="Arial" w:eastAsiaTheme="minorEastAsia"/>
+          <w:bCs/>
+          <w:kern w:val="32"/>
+          <w:szCs w:val="32"/>
+          <w:lang w:val="en-US" w:eastAsia="zh-CN" w:bidi="ar-SA"/>
+        </w:rPr>
+        <w:t>Популярные инструменты CI/CD</w:t>
+      </w:r>
+      <w:r>
+        <w:rPr>
+          <w:rFonts w:ascii="Arial" w:hAnsi="Arial" w:cs="Arial" w:eastAsiaTheme="minorEastAsia"/>
+          <w:bCs/>
+          <w:kern w:val="32"/>
+          <w:szCs w:val="32"/>
+          <w:lang w:val="en-US" w:eastAsia="zh-CN" w:bidi="ar-SA"/>
+        </w:rPr>
+        <w:tab/>
+      </w:r>
+      <w:r>
+        <w:rPr>
+          <w:rFonts w:ascii="Arial" w:hAnsi="Arial" w:cs="Arial" w:eastAsiaTheme="minorEastAsia"/>
+          <w:bCs/>
+          <w:kern w:val="32"/>
+          <w:szCs w:val="32"/>
+          <w:lang w:val="en-US" w:eastAsia="zh-CN" w:bidi="ar-SA"/>
+        </w:rPr>
+        <w:fldChar w:fldCharType="begin"/>
+      </w:r>
+      <w:r>
+        <w:rPr>
+          <w:rFonts w:ascii="Arial" w:hAnsi="Arial" w:cs="Arial" w:eastAsiaTheme="minorEastAsia"/>
+          <w:bCs/>
+          <w:kern w:val="32"/>
+          <w:szCs w:val="32"/>
+          <w:lang w:val="en-US" w:eastAsia="zh-CN" w:bidi="ar-SA"/>
+        </w:rPr>
+        <w:instrText xml:space="preserve"> PAGEREF _Toc16300 </w:instrText>
+      </w:r>
+      <w:r>
+        <w:rPr>
+          <w:rFonts w:ascii="Arial" w:hAnsi="Arial" w:cs="Arial" w:eastAsiaTheme="minorEastAsia"/>
+          <w:bCs/>
+          <w:kern w:val="32"/>
+          <w:szCs w:val="32"/>
+          <w:lang w:val="en-US" w:eastAsia="zh-CN" w:bidi="ar-SA"/>
+        </w:rPr>
+        <w:fldChar w:fldCharType="separate"/>
+      </w:r>
+      <w:r>
+        <w:rPr>
+          <w:rFonts w:ascii="Arial" w:hAnsi="Arial" w:cs="Arial" w:eastAsiaTheme="minorEastAsia"/>
+          <w:bCs/>
+          <w:kern w:val="32"/>
+          <w:szCs w:val="32"/>
+          <w:lang w:val="en-US" w:eastAsia="zh-CN" w:bidi="ar-SA"/>
+        </w:rPr>
+        <w:t>13</w:t>
+      </w:r>
+      <w:r>
+        <w:rPr>
+          <w:rFonts w:ascii="Arial" w:hAnsi="Arial" w:cs="Arial" w:eastAsiaTheme="minorEastAsia"/>
+          <w:bCs/>
+          <w:kern w:val="32"/>
+          <w:szCs w:val="32"/>
+          <w:lang w:val="en-US" w:eastAsia="zh-CN" w:bidi="ar-SA"/>
+        </w:rPr>
+        <w:fldChar w:fldCharType="end"/>
+      </w:r>
+      <w:r>
+        <w:rPr>
+          <w:rFonts w:hint="default" w:ascii="Arial" w:hAnsi="Arial" w:cs="Arial" w:eastAsiaTheme="minorEastAsia"/>
+          <w:bCs/>
+          <w:kern w:val="32"/>
+          <w:szCs w:val="32"/>
+          <w:lang w:val="en-US" w:eastAsia="zh-CN" w:bidi="ar-SA"/>
+        </w:rPr>
+        <w:fldChar w:fldCharType="end"/>
+      </w:r>
+    </w:p>
+    <w:p>
+      <w:pPr>
+        <w:pStyle w:val="10"/>
+        <w:tabs>
+          <w:tab w:val="right" w:leader="dot" w:pos="10466"/>
+        </w:tabs>
+        <w:rPr>
+          <w:rFonts w:ascii="Arial" w:hAnsi="Arial" w:cs="Arial" w:eastAsiaTheme="minorEastAsia"/>
+          <w:bCs/>
+          <w:kern w:val="32"/>
+          <w:szCs w:val="32"/>
+          <w:lang w:val="en-US" w:eastAsia="zh-CN" w:bidi="ar-SA"/>
+        </w:rPr>
+      </w:pPr>
+      <w:r>
+        <w:rPr>
+          <w:rFonts w:hint="default" w:ascii="Arial" w:hAnsi="Arial" w:cs="Arial" w:eastAsiaTheme="minorEastAsia"/>
+          <w:bCs/>
+          <w:kern w:val="32"/>
+          <w:szCs w:val="32"/>
+          <w:lang w:val="en-US" w:eastAsia="zh-CN" w:bidi="ar-SA"/>
+        </w:rPr>
+        <w:fldChar w:fldCharType="begin"/>
+      </w:r>
+      <w:r>
+        <w:rPr>
+          <w:rFonts w:hint="default" w:ascii="Arial" w:hAnsi="Arial" w:cs="Arial" w:eastAsiaTheme="minorEastAsia"/>
+          <w:bCs/>
+          <w:kern w:val="32"/>
+          <w:szCs w:val="32"/>
+          <w:lang w:val="en-US" w:eastAsia="zh-CN" w:bidi="ar-SA"/>
+        </w:rPr>
+        <w:instrText xml:space="preserve"> HYPERLINK \l _Toc21532 </w:instrText>
+      </w:r>
+      <w:r>
+        <w:rPr>
+          <w:rFonts w:hint="default" w:ascii="Arial" w:hAnsi="Arial" w:cs="Arial" w:eastAsiaTheme="minorEastAsia"/>
+          <w:bCs/>
+          <w:kern w:val="32"/>
+          <w:szCs w:val="32"/>
+          <w:lang w:val="en-US" w:eastAsia="zh-CN" w:bidi="ar-SA"/>
+        </w:rPr>
+        <w:fldChar w:fldCharType="separate"/>
+      </w:r>
+      <w:r>
+        <w:rPr>
+          <w:rFonts w:hint="default" w:ascii="Arial" w:hAnsi="Arial" w:cs="Arial" w:eastAsiaTheme="minorEastAsia"/>
+          <w:bCs/>
+          <w:kern w:val="32"/>
+          <w:szCs w:val="32"/>
+          <w:lang w:val="en-US" w:eastAsia="zh-CN" w:bidi="ar-SA"/>
+        </w:rPr>
+        <w:t>Подготовка тестов</w:t>
+      </w:r>
+      <w:r>
+        <w:rPr>
+          <w:rFonts w:ascii="Arial" w:hAnsi="Arial" w:cs="Arial" w:eastAsiaTheme="minorEastAsia"/>
+          <w:bCs/>
+          <w:kern w:val="32"/>
+          <w:szCs w:val="32"/>
+          <w:lang w:val="en-US" w:eastAsia="zh-CN" w:bidi="ar-SA"/>
+        </w:rPr>
+        <w:tab/>
+      </w:r>
+      <w:r>
+        <w:rPr>
+          <w:rFonts w:ascii="Arial" w:hAnsi="Arial" w:cs="Arial" w:eastAsiaTheme="minorEastAsia"/>
+          <w:bCs/>
+          <w:kern w:val="32"/>
+          <w:szCs w:val="32"/>
+          <w:lang w:val="en-US" w:eastAsia="zh-CN" w:bidi="ar-SA"/>
+        </w:rPr>
+        <w:fldChar w:fldCharType="begin"/>
+      </w:r>
+      <w:r>
+        <w:rPr>
+          <w:rFonts w:ascii="Arial" w:hAnsi="Arial" w:cs="Arial" w:eastAsiaTheme="minorEastAsia"/>
+          <w:bCs/>
+          <w:kern w:val="32"/>
+          <w:szCs w:val="32"/>
+          <w:lang w:val="en-US" w:eastAsia="zh-CN" w:bidi="ar-SA"/>
+        </w:rPr>
+        <w:instrText xml:space="preserve"> PAGEREF _Toc21532 </w:instrText>
+      </w:r>
+      <w:r>
+        <w:rPr>
+          <w:rFonts w:ascii="Arial" w:hAnsi="Arial" w:cs="Arial" w:eastAsiaTheme="minorEastAsia"/>
+          <w:bCs/>
+          <w:kern w:val="32"/>
+          <w:szCs w:val="32"/>
+          <w:lang w:val="en-US" w:eastAsia="zh-CN" w:bidi="ar-SA"/>
+        </w:rPr>
+        <w:fldChar w:fldCharType="separate"/>
+      </w:r>
+      <w:r>
+        <w:rPr>
+          <w:rFonts w:ascii="Arial" w:hAnsi="Arial" w:cs="Arial" w:eastAsiaTheme="minorEastAsia"/>
+          <w:bCs/>
+          <w:kern w:val="32"/>
+          <w:szCs w:val="32"/>
+          <w:lang w:val="en-US" w:eastAsia="zh-CN" w:bidi="ar-SA"/>
+        </w:rPr>
+        <w:t>13</w:t>
+      </w:r>
+      <w:r>
+        <w:rPr>
+          <w:rFonts w:ascii="Arial" w:hAnsi="Arial" w:cs="Arial" w:eastAsiaTheme="minorEastAsia"/>
+          <w:bCs/>
+          <w:kern w:val="32"/>
+          <w:szCs w:val="32"/>
+          <w:lang w:val="en-US" w:eastAsia="zh-CN" w:bidi="ar-SA"/>
+        </w:rPr>
+        <w:fldChar w:fldCharType="end"/>
+      </w:r>
+      <w:r>
+        <w:rPr>
+          <w:rFonts w:hint="default" w:ascii="Arial" w:hAnsi="Arial" w:cs="Arial" w:eastAsiaTheme="minorEastAsia"/>
+          <w:bCs/>
+          <w:kern w:val="32"/>
+          <w:szCs w:val="32"/>
+          <w:lang w:val="en-US" w:eastAsia="zh-CN" w:bidi="ar-SA"/>
+        </w:rPr>
+        <w:fldChar w:fldCharType="end"/>
+      </w:r>
+    </w:p>
+    <w:p>
+      <w:pPr>
+        <w:pStyle w:val="10"/>
+        <w:tabs>
+          <w:tab w:val="right" w:leader="dot" w:pos="10466"/>
+        </w:tabs>
+        <w:rPr>
+          <w:rFonts w:ascii="Arial" w:hAnsi="Arial" w:cs="Arial" w:eastAsiaTheme="minorEastAsia"/>
+          <w:bCs/>
+          <w:kern w:val="32"/>
+          <w:szCs w:val="32"/>
+          <w:lang w:val="en-US" w:eastAsia="zh-CN" w:bidi="ar-SA"/>
+        </w:rPr>
+      </w:pPr>
+      <w:r>
+        <w:rPr>
+          <w:rFonts w:hint="default" w:ascii="Arial" w:hAnsi="Arial" w:cs="Arial" w:eastAsiaTheme="minorEastAsia"/>
+          <w:bCs/>
+          <w:kern w:val="32"/>
+          <w:szCs w:val="32"/>
+          <w:lang w:val="en-US" w:eastAsia="zh-CN" w:bidi="ar-SA"/>
+        </w:rPr>
+        <w:fldChar w:fldCharType="begin"/>
+      </w:r>
+      <w:r>
+        <w:rPr>
+          <w:rFonts w:hint="default" w:ascii="Arial" w:hAnsi="Arial" w:cs="Arial" w:eastAsiaTheme="minorEastAsia"/>
+          <w:bCs/>
+          <w:kern w:val="32"/>
+          <w:szCs w:val="32"/>
+          <w:lang w:val="en-US" w:eastAsia="zh-CN" w:bidi="ar-SA"/>
+        </w:rPr>
+        <w:instrText xml:space="preserve"> HYPERLINK \l _Toc23549 </w:instrText>
+      </w:r>
+      <w:r>
+        <w:rPr>
+          <w:rFonts w:hint="default" w:ascii="Arial" w:hAnsi="Arial" w:cs="Arial" w:eastAsiaTheme="minorEastAsia"/>
+          <w:bCs/>
+          <w:kern w:val="32"/>
+          <w:szCs w:val="32"/>
+          <w:lang w:val="en-US" w:eastAsia="zh-CN" w:bidi="ar-SA"/>
+        </w:rPr>
+        <w:fldChar w:fldCharType="separate"/>
+      </w:r>
+      <w:r>
+        <w:rPr>
+          <w:rFonts w:hint="default" w:ascii="Arial" w:hAnsi="Arial" w:cs="Arial" w:eastAsiaTheme="minorEastAsia"/>
+          <w:bCs/>
+          <w:kern w:val="32"/>
+          <w:szCs w:val="32"/>
+          <w:lang w:val="en-US" w:eastAsia="zh-CN" w:bidi="ar-SA"/>
+        </w:rPr>
+        <w:t>Настройка CI/CD (на примере GitHub Actions)</w:t>
+      </w:r>
+      <w:r>
+        <w:rPr>
+          <w:rFonts w:ascii="Arial" w:hAnsi="Arial" w:cs="Arial" w:eastAsiaTheme="minorEastAsia"/>
+          <w:bCs/>
+          <w:kern w:val="32"/>
+          <w:szCs w:val="32"/>
+          <w:lang w:val="en-US" w:eastAsia="zh-CN" w:bidi="ar-SA"/>
+        </w:rPr>
+        <w:tab/>
+      </w:r>
+      <w:r>
+        <w:rPr>
+          <w:rFonts w:ascii="Arial" w:hAnsi="Arial" w:cs="Arial" w:eastAsiaTheme="minorEastAsia"/>
+          <w:bCs/>
+          <w:kern w:val="32"/>
+          <w:szCs w:val="32"/>
+          <w:lang w:val="en-US" w:eastAsia="zh-CN" w:bidi="ar-SA"/>
+        </w:rPr>
+        <w:fldChar w:fldCharType="begin"/>
+      </w:r>
+      <w:r>
+        <w:rPr>
+          <w:rFonts w:ascii="Arial" w:hAnsi="Arial" w:cs="Arial" w:eastAsiaTheme="minorEastAsia"/>
+          <w:bCs/>
+          <w:kern w:val="32"/>
+          <w:szCs w:val="32"/>
+          <w:lang w:val="en-US" w:eastAsia="zh-CN" w:bidi="ar-SA"/>
+        </w:rPr>
+        <w:instrText xml:space="preserve"> PAGEREF _Toc23549 </w:instrText>
+      </w:r>
+      <w:r>
+        <w:rPr>
+          <w:rFonts w:ascii="Arial" w:hAnsi="Arial" w:cs="Arial" w:eastAsiaTheme="minorEastAsia"/>
+          <w:bCs/>
+          <w:kern w:val="32"/>
+          <w:szCs w:val="32"/>
+          <w:lang w:val="en-US" w:eastAsia="zh-CN" w:bidi="ar-SA"/>
+        </w:rPr>
+        <w:fldChar w:fldCharType="separate"/>
+      </w:r>
+      <w:r>
+        <w:rPr>
+          <w:rFonts w:ascii="Arial" w:hAnsi="Arial" w:cs="Arial" w:eastAsiaTheme="minorEastAsia"/>
+          <w:bCs/>
+          <w:kern w:val="32"/>
+          <w:szCs w:val="32"/>
+          <w:lang w:val="en-US" w:eastAsia="zh-CN" w:bidi="ar-SA"/>
+        </w:rPr>
+        <w:t>13</w:t>
+      </w:r>
+      <w:r>
+        <w:rPr>
+          <w:rFonts w:ascii="Arial" w:hAnsi="Arial" w:cs="Arial" w:eastAsiaTheme="minorEastAsia"/>
+          <w:bCs/>
+          <w:kern w:val="32"/>
+          <w:szCs w:val="32"/>
+          <w:lang w:val="en-US" w:eastAsia="zh-CN" w:bidi="ar-SA"/>
+        </w:rPr>
+        <w:fldChar w:fldCharType="end"/>
+      </w:r>
+      <w:r>
+        <w:rPr>
+          <w:rFonts w:hint="default" w:ascii="Arial" w:hAnsi="Arial" w:cs="Arial" w:eastAsiaTheme="minorEastAsia"/>
+          <w:bCs/>
+          <w:kern w:val="32"/>
+          <w:szCs w:val="32"/>
+          <w:lang w:val="en-US" w:eastAsia="zh-CN" w:bidi="ar-SA"/>
+        </w:rPr>
+        <w:fldChar w:fldCharType="end"/>
+      </w:r>
+    </w:p>
+    <w:p>
+      <w:pPr>
+        <w:pStyle w:val="10"/>
+        <w:tabs>
+          <w:tab w:val="right" w:leader="dot" w:pos="10466"/>
+        </w:tabs>
+        <w:rPr>
+          <w:rFonts w:ascii="Arial" w:hAnsi="Arial" w:cs="Arial" w:eastAsiaTheme="minorEastAsia"/>
+          <w:bCs/>
+          <w:kern w:val="32"/>
+          <w:szCs w:val="32"/>
+          <w:lang w:val="en-US" w:eastAsia="zh-CN" w:bidi="ar-SA"/>
+        </w:rPr>
+      </w:pPr>
+      <w:r>
+        <w:rPr>
+          <w:rFonts w:hint="default" w:ascii="Arial" w:hAnsi="Arial" w:cs="Arial" w:eastAsiaTheme="minorEastAsia"/>
+          <w:bCs/>
+          <w:kern w:val="32"/>
+          <w:szCs w:val="32"/>
+          <w:lang w:val="en-US" w:eastAsia="zh-CN" w:bidi="ar-SA"/>
+        </w:rPr>
+        <w:fldChar w:fldCharType="begin"/>
+      </w:r>
+      <w:r>
+        <w:rPr>
+          <w:rFonts w:hint="default" w:ascii="Arial" w:hAnsi="Arial" w:cs="Arial" w:eastAsiaTheme="minorEastAsia"/>
+          <w:bCs/>
+          <w:kern w:val="32"/>
+          <w:szCs w:val="32"/>
+          <w:lang w:val="en-US" w:eastAsia="zh-CN" w:bidi="ar-SA"/>
+        </w:rPr>
+        <w:instrText xml:space="preserve"> HYPERLINK \l _Toc21559 </w:instrText>
+      </w:r>
+      <w:r>
+        <w:rPr>
+          <w:rFonts w:hint="default" w:ascii="Arial" w:hAnsi="Arial" w:cs="Arial" w:eastAsiaTheme="minorEastAsia"/>
+          <w:bCs/>
+          <w:kern w:val="32"/>
+          <w:szCs w:val="32"/>
+          <w:lang w:val="en-US" w:eastAsia="zh-CN" w:bidi="ar-SA"/>
+        </w:rPr>
+        <w:fldChar w:fldCharType="separate"/>
+      </w:r>
+      <w:r>
+        <w:rPr>
+          <w:rFonts w:hint="default" w:ascii="Arial" w:hAnsi="Arial" w:cs="Arial" w:eastAsiaTheme="minorEastAsia"/>
+          <w:bCs/>
+          <w:kern w:val="32"/>
+          <w:szCs w:val="32"/>
+          <w:lang w:val="en-US" w:eastAsia="zh-CN" w:bidi="ar-SA"/>
+        </w:rPr>
+        <w:t>Запуск тестов в CI/CD</w:t>
+      </w:r>
+      <w:r>
+        <w:rPr>
+          <w:rFonts w:ascii="Arial" w:hAnsi="Arial" w:cs="Arial" w:eastAsiaTheme="minorEastAsia"/>
+          <w:bCs/>
+          <w:kern w:val="32"/>
+          <w:szCs w:val="32"/>
+          <w:lang w:val="en-US" w:eastAsia="zh-CN" w:bidi="ar-SA"/>
+        </w:rPr>
+        <w:tab/>
+      </w:r>
+      <w:r>
+        <w:rPr>
+          <w:rFonts w:ascii="Arial" w:hAnsi="Arial" w:cs="Arial" w:eastAsiaTheme="minorEastAsia"/>
+          <w:bCs/>
+          <w:kern w:val="32"/>
+          <w:szCs w:val="32"/>
+          <w:lang w:val="en-US" w:eastAsia="zh-CN" w:bidi="ar-SA"/>
+        </w:rPr>
+        <w:fldChar w:fldCharType="begin"/>
+      </w:r>
+      <w:r>
+        <w:rPr>
+          <w:rFonts w:ascii="Arial" w:hAnsi="Arial" w:cs="Arial" w:eastAsiaTheme="minorEastAsia"/>
+          <w:bCs/>
+          <w:kern w:val="32"/>
+          <w:szCs w:val="32"/>
+          <w:lang w:val="en-US" w:eastAsia="zh-CN" w:bidi="ar-SA"/>
+        </w:rPr>
+        <w:instrText xml:space="preserve"> PAGEREF _Toc21559 </w:instrText>
+      </w:r>
+      <w:r>
+        <w:rPr>
+          <w:rFonts w:ascii="Arial" w:hAnsi="Arial" w:cs="Arial" w:eastAsiaTheme="minorEastAsia"/>
+          <w:bCs/>
+          <w:kern w:val="32"/>
+          <w:szCs w:val="32"/>
+          <w:lang w:val="en-US" w:eastAsia="zh-CN" w:bidi="ar-SA"/>
+        </w:rPr>
+        <w:fldChar w:fldCharType="separate"/>
+      </w:r>
+      <w:r>
+        <w:rPr>
+          <w:rFonts w:ascii="Arial" w:hAnsi="Arial" w:cs="Arial" w:eastAsiaTheme="minorEastAsia"/>
+          <w:bCs/>
+          <w:kern w:val="32"/>
+          <w:szCs w:val="32"/>
+          <w:lang w:val="en-US" w:eastAsia="zh-CN" w:bidi="ar-SA"/>
+        </w:rPr>
+        <w:t>14</w:t>
+      </w:r>
+      <w:r>
+        <w:rPr>
+          <w:rFonts w:ascii="Arial" w:hAnsi="Arial" w:cs="Arial" w:eastAsiaTheme="minorEastAsia"/>
+          <w:bCs/>
+          <w:kern w:val="32"/>
+          <w:szCs w:val="32"/>
+          <w:lang w:val="en-US" w:eastAsia="zh-CN" w:bidi="ar-SA"/>
+        </w:rPr>
+        <w:fldChar w:fldCharType="end"/>
+      </w:r>
+      <w:r>
+        <w:rPr>
+          <w:rFonts w:hint="default" w:ascii="Arial" w:hAnsi="Arial" w:cs="Arial" w:eastAsiaTheme="minorEastAsia"/>
+          <w:bCs/>
+          <w:kern w:val="32"/>
+          <w:szCs w:val="32"/>
+          <w:lang w:val="en-US" w:eastAsia="zh-CN" w:bidi="ar-SA"/>
+        </w:rPr>
+        <w:fldChar w:fldCharType="end"/>
+      </w:r>
+    </w:p>
+    <w:p>
+      <w:pPr>
         <w:pStyle w:val="2"/>
         <w:rPr>
           <w:rFonts w:hint="default"/>
@@ -3331,7 +5206,7 @@
           <w:rFonts w:hint="default"/>
         </w:rPr>
       </w:pPr>
-      <w:bookmarkStart w:id="0" w:name="_Toc14796"/>
+      <w:bookmarkStart w:id="0" w:name="_Toc32000"/>
       <w:r>
         <w:rPr>
           <w:rFonts w:hint="default"/>
@@ -3629,7 +5504,7 @@
           <w:rFonts w:hint="default"/>
         </w:rPr>
       </w:pPr>
-      <w:bookmarkStart w:id="1" w:name="_Toc20107"/>
+      <w:bookmarkStart w:id="1" w:name="_Toc10564"/>
       <w:r>
         <w:rPr>
           <w:rFonts w:hint="default"/>
@@ -5154,7 +7029,7 @@
           <w:rFonts w:hint="default"/>
         </w:rPr>
       </w:pPr>
-      <w:bookmarkStart w:id="2" w:name="_Toc1115"/>
+      <w:bookmarkStart w:id="2" w:name="_Toc15017"/>
       <w:r>
         <w:rPr>
           <w:rFonts w:hint="default"/>
@@ -6422,7 +8297,7 @@
           <w:rFonts w:hint="default"/>
         </w:rPr>
       </w:pPr>
-      <w:bookmarkStart w:id="3" w:name="_Toc24054"/>
+      <w:bookmarkStart w:id="3" w:name="_Toc19737"/>
       <w:r>
         <w:rPr>
           <w:rFonts w:hint="default"/>
@@ -6865,7 +8740,7 @@
           <w:rFonts w:hint="default"/>
         </w:rPr>
       </w:pPr>
-      <w:bookmarkStart w:id="4" w:name="_Toc6769"/>
+      <w:bookmarkStart w:id="4" w:name="_Toc26207"/>
       <w:r>
         <w:rPr>
           <w:rFonts w:hint="default"/>
@@ -7104,7 +8979,7 @@
           <w:rFonts w:hint="default"/>
         </w:rPr>
       </w:pPr>
-      <w:bookmarkStart w:id="5" w:name="_Toc6603"/>
+      <w:bookmarkStart w:id="5" w:name="_Toc31613"/>
       <w:r>
         <w:rPr>
           <w:rFonts w:hint="default"/>
@@ -7173,7 +9048,7 @@
           <w:rFonts w:hint="default"/>
         </w:rPr>
       </w:pPr>
-      <w:bookmarkStart w:id="6" w:name="_Toc2892"/>
+      <w:bookmarkStart w:id="6" w:name="_Toc24897"/>
       <w:r>
         <w:rPr>
           <w:rFonts w:hint="default"/>
@@ -7268,7 +9143,7 @@
           <w:rFonts w:hint="default"/>
         </w:rPr>
       </w:pPr>
-      <w:bookmarkStart w:id="7" w:name="_Toc32329"/>
+      <w:bookmarkStart w:id="7" w:name="_Toc10446"/>
       <w:r>
         <w:rPr>
           <w:rFonts w:hint="default"/>
@@ -7363,7 +9238,7 @@
           <w:rFonts w:hint="default"/>
         </w:rPr>
       </w:pPr>
-      <w:bookmarkStart w:id="8" w:name="_Toc19521"/>
+      <w:bookmarkStart w:id="8" w:name="_Toc28423"/>
       <w:r>
         <w:rPr>
           <w:rFonts w:hint="default"/>
@@ -7386,7 +9261,7 @@
           <w:rFonts w:hint="default"/>
         </w:rPr>
       </w:pPr>
-      <w:bookmarkStart w:id="9" w:name="_Toc13630"/>
+      <w:bookmarkStart w:id="9" w:name="_Toc28527"/>
       <w:r>
         <w:rPr>
           <w:rFonts w:hint="default"/>
@@ -7482,7 +9357,7 @@
           <w:rFonts w:hint="default"/>
         </w:rPr>
       </w:pPr>
-      <w:bookmarkStart w:id="10" w:name="_Toc27271"/>
+      <w:bookmarkStart w:id="10" w:name="_Toc14315"/>
       <w:r>
         <w:rPr>
           <w:rFonts w:hint="default"/>
@@ -7650,7 +9525,7 @@
           <w:rFonts w:hint="default"/>
         </w:rPr>
       </w:pPr>
-      <w:bookmarkStart w:id="11" w:name="_Toc32543"/>
+      <w:bookmarkStart w:id="11" w:name="_Toc30858"/>
       <w:r>
         <w:rPr>
           <w:rFonts w:hint="default"/>
@@ -7851,7 +9726,7 @@
           <w:rFonts w:hint="default"/>
         </w:rPr>
       </w:pPr>
-      <w:bookmarkStart w:id="12" w:name="_Toc21618"/>
+      <w:bookmarkStart w:id="12" w:name="_Toc17122"/>
       <w:r>
         <w:rPr>
           <w:rFonts w:hint="default"/>
@@ -7926,7 +9801,7 @@
           <w:rFonts w:hint="default"/>
         </w:rPr>
       </w:pPr>
-      <w:bookmarkStart w:id="13" w:name="_Toc18902"/>
+      <w:bookmarkStart w:id="13" w:name="_Toc28653"/>
       <w:r>
         <w:rPr>
           <w:rFonts w:hint="default"/>
@@ -8055,7 +9930,7 @@
           <w:rFonts w:hint="default"/>
         </w:rPr>
       </w:pPr>
-      <w:bookmarkStart w:id="14" w:name="_Toc15750"/>
+      <w:bookmarkStart w:id="14" w:name="_Toc29317"/>
       <w:r>
         <w:rPr>
           <w:rFonts w:hint="default"/>
@@ -8224,7 +10099,7 @@
           <w:rFonts w:hint="default"/>
         </w:rPr>
       </w:pPr>
-      <w:bookmarkStart w:id="15" w:name="_Toc2836"/>
+      <w:bookmarkStart w:id="15" w:name="_Toc965"/>
       <w:r>
         <w:rPr>
           <w:rFonts w:hint="default"/>
@@ -8405,7 +10280,7 @@
           <w:rFonts w:hint="default"/>
         </w:rPr>
       </w:pPr>
-      <w:bookmarkStart w:id="16" w:name="_Toc31743"/>
+      <w:bookmarkStart w:id="16" w:name="_Toc8794"/>
       <w:r>
         <w:rPr>
           <w:rFonts w:hint="default"/>
@@ -8480,7 +10355,7 @@
           <w:rFonts w:hint="default"/>
         </w:rPr>
       </w:pPr>
-      <w:bookmarkStart w:id="17" w:name="_Toc25133"/>
+      <w:bookmarkStart w:id="17" w:name="_Toc14153"/>
       <w:r>
         <w:rPr>
           <w:rFonts w:hint="default"/>
@@ -8651,7 +10526,7 @@
       <w:pPr>
         <w:pStyle w:val="2"/>
       </w:pPr>
-      <w:bookmarkStart w:id="18" w:name="_Toc29638"/>
+      <w:bookmarkStart w:id="18" w:name="_Toc12133"/>
       <w:r>
         <w:rPr>
           <w:rFonts w:hint="default"/>
@@ -8674,7 +10549,7 @@
           <w:rFonts w:hint="default"/>
         </w:rPr>
       </w:pPr>
-      <w:bookmarkStart w:id="19" w:name="_Toc26048"/>
+      <w:bookmarkStart w:id="19" w:name="_Toc18315"/>
       <w:r>
         <w:rPr>
           <w:rFonts w:hint="default"/>
@@ -8690,7 +10565,7 @@
           <w:rFonts w:hint="default"/>
         </w:rPr>
       </w:pPr>
-      <w:bookmarkStart w:id="20" w:name="_Toc496"/>
+      <w:bookmarkStart w:id="20" w:name="_Toc19996"/>
       <w:r>
         <w:rPr>
           <w:rFonts w:hint="default"/>
@@ -8869,7 +10744,7 @@
           <w:rFonts w:hint="default"/>
         </w:rPr>
       </w:pPr>
-      <w:bookmarkStart w:id="21" w:name="_Toc25533"/>
+      <w:bookmarkStart w:id="21" w:name="_Toc7181"/>
       <w:r>
         <w:rPr>
           <w:rFonts w:hint="default"/>
@@ -9028,7 +10903,7 @@
           <w:rFonts w:hint="default"/>
         </w:rPr>
       </w:pPr>
-      <w:bookmarkStart w:id="22" w:name="_Toc13612"/>
+      <w:bookmarkStart w:id="22" w:name="_Toc24895"/>
       <w:r>
         <w:rPr>
           <w:rFonts w:hint="default"/>
@@ -9187,7 +11062,7 @@
           <w:rFonts w:hint="default"/>
         </w:rPr>
       </w:pPr>
-      <w:bookmarkStart w:id="23" w:name="_Toc17115"/>
+      <w:bookmarkStart w:id="23" w:name="_Toc18639"/>
       <w:r>
         <w:rPr>
           <w:rFonts w:hint="default"/>
@@ -9398,7 +11273,7 @@
           <w:rFonts w:hint="default"/>
         </w:rPr>
       </w:pPr>
-      <w:bookmarkStart w:id="24" w:name="_Toc10323"/>
+      <w:bookmarkStart w:id="24" w:name="_Toc24604"/>
       <w:r>
         <w:rPr>
           <w:rFonts w:hint="default"/>
@@ -9583,7 +11458,7 @@
           <w:rFonts w:hint="default"/>
         </w:rPr>
       </w:pPr>
-      <w:bookmarkStart w:id="25" w:name="_Toc26018"/>
+      <w:bookmarkStart w:id="25" w:name="_Toc5611"/>
       <w:r>
         <w:rPr>
           <w:rFonts w:hint="default"/>
@@ -9827,12 +11702,14 @@
           <w:rFonts w:hint="default"/>
         </w:rPr>
       </w:pPr>
+      <w:bookmarkStart w:id="26" w:name="_Toc4168"/>
       <w:r>
         <w:rPr>
           <w:rFonts w:hint="default"/>
         </w:rPr>
         <w:t>5.1 Работа с AJAX и динамическими элементами</w:t>
       </w:r>
+      <w:bookmarkEnd w:id="26"/>
     </w:p>
     <w:p>
       <w:pPr>
@@ -9848,12 +11725,14 @@
           <w:rFonts w:hint="default"/>
         </w:rPr>
       </w:pPr>
+      <w:bookmarkStart w:id="27" w:name="_Toc24833"/>
       <w:r>
         <w:rPr>
           <w:rFonts w:hint="default"/>
         </w:rPr>
         <w:t>Работа с AJAX и динамическими элементами</w:t>
       </w:r>
+      <w:bookmarkEnd w:id="27"/>
     </w:p>
     <w:p>
       <w:pPr>
@@ -9926,12 +11805,14 @@
           <w:rFonts w:hint="default"/>
         </w:rPr>
       </w:pPr>
+      <w:bookmarkStart w:id="28" w:name="_Toc13785"/>
       <w:r>
         <w:rPr>
           <w:rFonts w:hint="default"/>
         </w:rPr>
         <w:t>Проблемы при тестировании</w:t>
       </w:r>
+      <w:bookmarkEnd w:id="28"/>
     </w:p>
     <w:p>
       <w:pPr>
@@ -10007,12 +11888,14 @@
           <w:rFonts w:hint="default"/>
         </w:rPr>
       </w:pPr>
+      <w:bookmarkStart w:id="29" w:name="_Toc3831"/>
       <w:r>
         <w:rPr>
           <w:rFonts w:hint="default"/>
         </w:rPr>
         <w:t>Решение: Ожидания (Waits)</w:t>
       </w:r>
+      <w:bookmarkEnd w:id="29"/>
     </w:p>
     <w:p>
       <w:pPr>
@@ -10354,12 +12237,14 @@
           <w:rFonts w:hint="default"/>
         </w:rPr>
       </w:pPr>
+      <w:bookmarkStart w:id="30" w:name="_Toc13979"/>
       <w:r>
         <w:rPr>
           <w:rFonts w:hint="default"/>
         </w:rPr>
         <w:t>Условия для ожиданий</w:t>
       </w:r>
+      <w:bookmarkEnd w:id="30"/>
     </w:p>
     <w:p>
       <w:pPr>
@@ -10544,12 +12429,14 @@
           <w:rFonts w:hint="default"/>
         </w:rPr>
       </w:pPr>
+      <w:bookmarkStart w:id="31" w:name="_Toc14563"/>
       <w:r>
         <w:rPr>
           <w:rFonts w:hint="default"/>
         </w:rPr>
         <w:t>Пример: Тестирование AJAX-загрузки</w:t>
       </w:r>
+      <w:bookmarkEnd w:id="31"/>
     </w:p>
     <w:p>
       <w:pPr>
@@ -10903,12 +12790,14 @@
           <w:rFonts w:hint="default"/>
         </w:rPr>
       </w:pPr>
+      <w:bookmarkStart w:id="32" w:name="_Toc20450"/>
       <w:r>
         <w:rPr>
           <w:rFonts w:hint="default"/>
         </w:rPr>
         <w:t>Частые ошибки и их решение</w:t>
       </w:r>
+      <w:bookmarkEnd w:id="32"/>
     </w:p>
     <w:p>
       <w:pPr>
@@ -11170,12 +13059,14 @@
           <w:rFonts w:hint="default"/>
         </w:rPr>
       </w:pPr>
+      <w:bookmarkStart w:id="33" w:name="_Toc21780"/>
       <w:r>
         <w:rPr>
           <w:rFonts w:hint="default"/>
         </w:rPr>
         <w:t>Дополнительные советы</w:t>
       </w:r>
+      <w:bookmarkEnd w:id="33"/>
     </w:p>
     <w:p>
       <w:pPr>
@@ -11264,12 +13155,14 @@
           <w:rFonts w:hint="default"/>
         </w:rPr>
       </w:pPr>
+      <w:bookmarkStart w:id="34" w:name="_Toc15324"/>
       <w:r>
         <w:rPr>
           <w:rFonts w:hint="default"/>
         </w:rPr>
         <w:t>6.1 Настройка автоматического запуска тестов</w:t>
       </w:r>
+      <w:bookmarkEnd w:id="34"/>
     </w:p>
     <w:p>
       <w:pPr>
@@ -11298,12 +13191,14 @@
           <w:rFonts w:hint="default"/>
         </w:rPr>
       </w:pPr>
+      <w:bookmarkStart w:id="35" w:name="_Toc26008"/>
       <w:r>
         <w:rPr>
           <w:rFonts w:hint="default"/>
         </w:rPr>
         <w:t>Что такое CI/CD?</w:t>
       </w:r>
+      <w:bookmarkEnd w:id="35"/>
     </w:p>
     <w:p>
       <w:pPr>
@@ -11372,12 +13267,14 @@
           <w:rFonts w:hint="default"/>
         </w:rPr>
       </w:pPr>
+      <w:bookmarkStart w:id="36" w:name="_Toc19097"/>
       <w:r>
         <w:rPr>
           <w:rFonts w:hint="default"/>
         </w:rPr>
         <w:t>Зачем интегрировать тесты в CI/CD</w:t>
       </w:r>
+      <w:bookmarkEnd w:id="36"/>
     </w:p>
     <w:p>
       <w:pPr>
@@ -11453,12 +13350,14 @@
           <w:rFonts w:hint="default"/>
         </w:rPr>
       </w:pPr>
+      <w:bookmarkStart w:id="37" w:name="_Toc16300"/>
       <w:r>
         <w:rPr>
           <w:rFonts w:hint="default"/>
         </w:rPr>
         <w:t>Популярные инструменты CI/CD</w:t>
       </w:r>
+      <w:bookmarkEnd w:id="37"/>
     </w:p>
     <w:p>
       <w:pPr>
@@ -11593,12 +13492,14 @@
           <w:rFonts w:hint="default"/>
         </w:rPr>
       </w:pPr>
+      <w:bookmarkStart w:id="38" w:name="_Toc21532"/>
       <w:r>
         <w:rPr>
           <w:rFonts w:hint="default"/>
         </w:rPr>
         <w:t>Подготовка тестов</w:t>
       </w:r>
+      <w:bookmarkEnd w:id="38"/>
     </w:p>
     <w:p>
       <w:pPr>
@@ -11850,12 +13751,14 @@
           <w:rFonts w:hint="default"/>
         </w:rPr>
       </w:pPr>
+      <w:bookmarkStart w:id="39" w:name="_Toc23549"/>
       <w:r>
         <w:rPr>
           <w:rFonts w:hint="default"/>
         </w:rPr>
         <w:t>Настройка CI/CD (на примере GitHub Actions)</w:t>
       </w:r>
+      <w:bookmarkEnd w:id="39"/>
     </w:p>
     <w:p>
       <w:pPr>
@@ -12499,12 +14402,14 @@
           <w:rFonts w:hint="default"/>
         </w:rPr>
       </w:pPr>
+      <w:bookmarkStart w:id="40" w:name="_Toc21559"/>
       <w:r>
         <w:rPr>
           <w:rFonts w:hint="default"/>
         </w:rPr>
         <w:t>Запуск тестов в CI/CD</w:t>
       </w:r>
+      <w:bookmarkEnd w:id="40"/>
     </w:p>
     <w:p>
       <w:pPr>
@@ -12562,24 +14467,1447 @@
     </w:p>
     <w:p>
       <w:pPr>
-        <w:rPr>
-          <w:rFonts w:hint="default"/>
-        </w:rPr>
-      </w:pPr>
-      <w:r>
-        <w:rPr>
-          <w:rFonts w:hint="default"/>
-          <w:lang w:val="en-US"/>
+        <w:numPr>
+          <w:ilvl w:val="0"/>
+          <w:numId w:val="1"/>
+        </w:numPr>
+        <w:rPr>
+          <w:rFonts w:hint="default"/>
+        </w:rPr>
+      </w:pPr>
+      <w:r>
+        <w:rPr>
+          <w:rFonts w:hint="default"/>
+        </w:rPr>
+        <w:t>Убедитесь, что workflow запустился и тесты прошли успешно.</w:t>
+      </w:r>
+    </w:p>
+    <w:p>
+      <w:pPr>
+        <w:numPr>
+          <w:numId w:val="0"/>
+        </w:numPr>
+        <w:rPr>
+          <w:rFonts w:hint="default"/>
+        </w:rPr>
+      </w:pPr>
+    </w:p>
+    <w:p>
+      <w:pPr>
+        <w:numPr>
+          <w:numId w:val="0"/>
+        </w:numPr>
+        <w:rPr>
+          <w:rFonts w:hint="default"/>
+        </w:rPr>
+      </w:pPr>
+    </w:p>
+    <w:p>
+      <w:pPr>
+        <w:pStyle w:val="3"/>
+        <w:rPr>
+          <w:rFonts w:hint="default"/>
+        </w:rPr>
+      </w:pPr>
+      <w:r>
+        <w:rPr>
+          <w:rFonts w:hint="default"/>
+        </w:rPr>
+        <w:t>Дополнительные настройки</w:t>
+      </w:r>
+    </w:p>
+    <w:p>
+      <w:pPr>
+        <w:numPr>
+          <w:numId w:val="0"/>
+        </w:numPr>
+        <w:rPr>
+          <w:rFonts w:hint="default"/>
+          <w:b/>
+          <w:bCs/>
+        </w:rPr>
+      </w:pPr>
+      <w:r>
+        <w:rPr>
+          <w:rFonts w:hint="default"/>
+          <w:b/>
+          <w:bCs/>
+          <w:lang w:val="ru-RU"/>
+        </w:rPr>
+        <w:t xml:space="preserve">1. </w:t>
+      </w:r>
+      <w:r>
+        <w:rPr>
+          <w:rFonts w:hint="default"/>
+          <w:b/>
+          <w:bCs/>
+        </w:rPr>
+        <w:t>Уведомления:</w:t>
+      </w:r>
+    </w:p>
+    <w:p>
+      <w:pPr>
+        <w:numPr>
+          <w:numId w:val="0"/>
+        </w:numPr>
+        <w:rPr>
+          <w:rFonts w:hint="default"/>
+        </w:rPr>
+      </w:pPr>
+      <w:r>
+        <w:rPr>
+          <w:rFonts w:hint="default"/>
+        </w:rPr>
+        <w:t>Настройте уведомления в Slack, Telegram или по email о результатах тестов.</w:t>
+      </w:r>
+    </w:p>
+    <w:p>
+      <w:pPr>
+        <w:numPr>
+          <w:numId w:val="0"/>
+        </w:numPr>
+        <w:rPr>
+          <w:rFonts w:hint="default"/>
+        </w:rPr>
+      </w:pPr>
+    </w:p>
+    <w:p>
+      <w:pPr>
+        <w:numPr>
+          <w:numId w:val="0"/>
+        </w:numPr>
+        <w:rPr>
+          <w:rFonts w:hint="default"/>
+          <w:b/>
+          <w:bCs/>
+        </w:rPr>
+      </w:pPr>
+      <w:r>
+        <w:rPr>
+          <w:rFonts w:hint="default"/>
+          <w:b/>
+          <w:bCs/>
+          <w:lang w:val="ru-RU"/>
+        </w:rPr>
+        <w:t xml:space="preserve">2. </w:t>
+      </w:r>
+      <w:r>
+        <w:rPr>
+          <w:rFonts w:hint="default"/>
+          <w:b/>
+          <w:bCs/>
+        </w:rPr>
+        <w:t>Артефакты:</w:t>
+      </w:r>
+    </w:p>
+    <w:p>
+      <w:pPr>
+        <w:numPr>
+          <w:numId w:val="0"/>
+        </w:numPr>
+        <w:rPr>
+          <w:rFonts w:hint="default"/>
+        </w:rPr>
+      </w:pPr>
+      <w:r>
+        <w:rPr>
+          <w:rFonts w:hint="default"/>
+        </w:rPr>
+        <w:t>Сохраняйте логи и отчёты о тестировании.</w:t>
+      </w:r>
+    </w:p>
+    <w:p>
+      <w:pPr>
+        <w:numPr>
+          <w:numId w:val="0"/>
+        </w:numPr>
+        <w:rPr>
+          <w:rFonts w:hint="default"/>
+        </w:rPr>
+      </w:pPr>
+    </w:p>
+    <w:p>
+      <w:pPr>
+        <w:numPr>
+          <w:numId w:val="0"/>
+        </w:numPr>
+        <w:rPr>
+          <w:rFonts w:hint="default"/>
+          <w:b/>
+          <w:bCs/>
+        </w:rPr>
+      </w:pPr>
+      <w:r>
+        <w:rPr>
+          <w:rFonts w:hint="default"/>
+          <w:b/>
+          <w:bCs/>
+        </w:rPr>
+        <w:t>Пример:</w:t>
+      </w:r>
+    </w:p>
+    <w:p>
+      <w:pPr>
+        <w:numPr>
+          <w:numId w:val="0"/>
+        </w:numPr>
+        <w:rPr>
+          <w:rFonts w:hint="default"/>
+        </w:rPr>
+      </w:pPr>
+    </w:p>
+    <w:p>
+      <w:pPr>
+        <w:numPr>
+          <w:numId w:val="0"/>
+        </w:numPr>
+        <w:rPr>
+          <w:rFonts w:hint="default"/>
+        </w:rPr>
+      </w:pPr>
+      <w:r>
+        <w:rPr>
+          <w:rFonts w:hint="default"/>
+        </w:rPr>
+        <w:t>- name: Upload test results</w:t>
+      </w:r>
+    </w:p>
+    <w:p>
+      <w:pPr>
+        <w:numPr>
+          <w:numId w:val="0"/>
+        </w:numPr>
+        <w:rPr>
+          <w:rFonts w:hint="default"/>
+        </w:rPr>
+      </w:pPr>
+      <w:r>
+        <w:rPr>
+          <w:rFonts w:hint="default"/>
+        </w:rPr>
+        <w:t xml:space="preserve">  uses: actions/upload-artifact@v2</w:t>
+      </w:r>
+    </w:p>
+    <w:p>
+      <w:pPr>
+        <w:numPr>
+          <w:numId w:val="0"/>
+        </w:numPr>
+        <w:rPr>
+          <w:rFonts w:hint="default"/>
+        </w:rPr>
+      </w:pPr>
+      <w:r>
+        <w:rPr>
+          <w:rFonts w:hint="default"/>
+        </w:rPr>
+        <w:t xml:space="preserve">  with:</w:t>
+      </w:r>
+    </w:p>
+    <w:p>
+      <w:pPr>
+        <w:numPr>
+          <w:numId w:val="0"/>
+        </w:numPr>
+        <w:rPr>
+          <w:rFonts w:hint="default"/>
+        </w:rPr>
+      </w:pPr>
+      <w:r>
+        <w:rPr>
+          <w:rFonts w:hint="default"/>
+        </w:rPr>
+        <w:t xml:space="preserve">    name: test-results</w:t>
+      </w:r>
+    </w:p>
+    <w:p>
+      <w:pPr>
+        <w:numPr>
+          <w:numId w:val="0"/>
+        </w:numPr>
+        <w:rPr>
+          <w:rFonts w:hint="default"/>
+        </w:rPr>
+      </w:pPr>
+      <w:r>
+        <w:rPr>
+          <w:rFonts w:hint="default"/>
+        </w:rPr>
+        <w:t xml:space="preserve">    path: test-results/</w:t>
+      </w:r>
+    </w:p>
+    <w:p>
+      <w:pPr>
+        <w:numPr>
+          <w:numId w:val="0"/>
+        </w:numPr>
+        <w:rPr>
+          <w:rFonts w:hint="default"/>
+        </w:rPr>
+      </w:pPr>
+    </w:p>
+    <w:p>
+      <w:pPr>
+        <w:numPr>
+          <w:numId w:val="0"/>
+        </w:numPr>
+        <w:rPr>
+          <w:rFonts w:hint="default"/>
+        </w:rPr>
+      </w:pPr>
+      <w:r>
+        <w:rPr>
+          <w:rFonts w:hint="default"/>
+        </w:rPr>
+        <w:t xml:space="preserve">                  </w:t>
+      </w:r>
+    </w:p>
+    <w:p>
+      <w:pPr>
+        <w:numPr>
+          <w:numId w:val="0"/>
+        </w:numPr>
+        <w:rPr>
+          <w:rFonts w:hint="default"/>
+          <w:b/>
+          <w:bCs/>
+        </w:rPr>
+      </w:pPr>
+      <w:r>
+        <w:rPr>
+          <w:rFonts w:hint="default"/>
+          <w:b/>
+          <w:bCs/>
+          <w:lang w:val="ru-RU"/>
         </w:rPr>
         <w:t xml:space="preserve">3. </w:t>
       </w:r>
-      <w:bookmarkStart w:id="26" w:name="_GoBack"/>
-      <w:bookmarkEnd w:id="26"/>
-      <w:r>
-        <w:rPr>
-          <w:rFonts w:hint="default"/>
-        </w:rPr>
-        <w:t>Убедитесь, что workflow запустился и тесты прошли успешно.</w:t>
+      <w:r>
+        <w:rPr>
+          <w:rFonts w:hint="default"/>
+          <w:b/>
+          <w:bCs/>
+        </w:rPr>
+        <w:t>Параллельный запуск тестов:</w:t>
+      </w:r>
+    </w:p>
+    <w:p>
+      <w:pPr>
+        <w:numPr>
+          <w:numId w:val="0"/>
+        </w:numPr>
+        <w:rPr>
+          <w:rFonts w:hint="default"/>
+        </w:rPr>
+      </w:pPr>
+      <w:r>
+        <w:rPr>
+          <w:rFonts w:hint="default"/>
+        </w:rPr>
+        <w:t>Разделите тесты на несколько групп для ускорения выполнения.</w:t>
+      </w:r>
+    </w:p>
+    <w:p>
+      <w:pPr>
+        <w:numPr>
+          <w:numId w:val="0"/>
+        </w:numPr>
+        <w:rPr>
+          <w:rFonts w:hint="default"/>
+        </w:rPr>
+      </w:pPr>
+    </w:p>
+    <w:p>
+      <w:pPr>
+        <w:numPr>
+          <w:numId w:val="0"/>
+        </w:numPr>
+        <w:rPr>
+          <w:rFonts w:hint="default"/>
+          <w:b/>
+          <w:bCs/>
+        </w:rPr>
+      </w:pPr>
+      <w:r>
+        <w:rPr>
+          <w:rFonts w:hint="default"/>
+          <w:b/>
+          <w:bCs/>
+        </w:rPr>
+        <w:t>Пример:</w:t>
+      </w:r>
+    </w:p>
+    <w:p>
+      <w:pPr>
+        <w:numPr>
+          <w:numId w:val="0"/>
+        </w:numPr>
+        <w:rPr>
+          <w:rFonts w:hint="default"/>
+        </w:rPr>
+      </w:pPr>
+    </w:p>
+    <w:p>
+      <w:pPr>
+        <w:numPr>
+          <w:numId w:val="0"/>
+        </w:numPr>
+        <w:rPr>
+          <w:rFonts w:hint="default"/>
+        </w:rPr>
+      </w:pPr>
+      <w:r>
+        <w:rPr>
+          <w:rFonts w:hint="default"/>
+        </w:rPr>
+        <w:t>strategy:</w:t>
+      </w:r>
+    </w:p>
+    <w:p>
+      <w:pPr>
+        <w:numPr>
+          <w:numId w:val="0"/>
+        </w:numPr>
+        <w:rPr>
+          <w:rFonts w:hint="default"/>
+        </w:rPr>
+      </w:pPr>
+      <w:r>
+        <w:rPr>
+          <w:rFonts w:hint="default"/>
+        </w:rPr>
+        <w:t xml:space="preserve">  matrix:</w:t>
+      </w:r>
+    </w:p>
+    <w:p>
+      <w:pPr>
+        <w:numPr>
+          <w:numId w:val="0"/>
+        </w:numPr>
+        <w:rPr>
+          <w:rFonts w:hint="default"/>
+        </w:rPr>
+      </w:pPr>
+      <w:r>
+        <w:rPr>
+          <w:rFonts w:hint="default"/>
+        </w:rPr>
+        <w:t xml:space="preserve">    test-group: [1, 2, 3]</w:t>
+      </w:r>
+    </w:p>
+    <w:p>
+      <w:pPr>
+        <w:numPr>
+          <w:numId w:val="0"/>
+        </w:numPr>
+        <w:rPr>
+          <w:rFonts w:hint="default"/>
+        </w:rPr>
+      </w:pPr>
+      <w:r>
+        <w:rPr>
+          <w:rFonts w:hint="default"/>
+        </w:rPr>
+        <w:t>steps:</w:t>
+      </w:r>
+    </w:p>
+    <w:p>
+      <w:pPr>
+        <w:numPr>
+          <w:numId w:val="0"/>
+        </w:numPr>
+        <w:rPr>
+          <w:rFonts w:hint="default"/>
+        </w:rPr>
+      </w:pPr>
+      <w:r>
+        <w:rPr>
+          <w:rFonts w:hint="default"/>
+        </w:rPr>
+        <w:t xml:space="preserve">  - name: Run tests</w:t>
+      </w:r>
+    </w:p>
+    <w:p>
+      <w:pPr>
+        <w:numPr>
+          <w:numId w:val="0"/>
+        </w:numPr>
+        <w:ind w:firstLine="400"/>
+        <w:rPr>
+          <w:rFonts w:hint="default"/>
+        </w:rPr>
+      </w:pPr>
+      <w:r>
+        <w:rPr>
+          <w:rFonts w:hint="default"/>
+        </w:rPr>
+        <w:t>run: pytest tests/group-${{ matrix.test-group }}/</w:t>
+      </w:r>
+    </w:p>
+    <w:p>
+      <w:pPr>
+        <w:numPr>
+          <w:numId w:val="0"/>
+        </w:numPr>
+        <w:ind w:firstLine="400"/>
+        <w:rPr>
+          <w:rFonts w:hint="default"/>
+        </w:rPr>
+      </w:pPr>
+    </w:p>
+    <w:p>
+      <w:pPr>
+        <w:numPr>
+          <w:numId w:val="0"/>
+        </w:numPr>
+        <w:ind w:firstLine="400"/>
+        <w:rPr>
+          <w:rFonts w:hint="default"/>
+        </w:rPr>
+      </w:pPr>
+    </w:p>
+    <w:p>
+      <w:pPr>
+        <w:pStyle w:val="3"/>
+        <w:rPr>
+          <w:rFonts w:hint="default"/>
+        </w:rPr>
+      </w:pPr>
+      <w:r>
+        <w:rPr>
+          <w:rFonts w:hint="default"/>
+        </w:rPr>
+        <w:t>Пример интеграции с Jenkins</w:t>
+      </w:r>
+    </w:p>
+    <w:p>
+      <w:pPr>
+        <w:numPr>
+          <w:numId w:val="0"/>
+        </w:numPr>
+        <w:rPr>
+          <w:rFonts w:hint="default"/>
+        </w:rPr>
+      </w:pPr>
+      <w:r>
+        <w:rPr>
+          <w:rFonts w:hint="default"/>
+        </w:rPr>
+        <w:t>Если вы используете Jenkins, настройка будет выглядеть так:</w:t>
+      </w:r>
+    </w:p>
+    <w:p>
+      <w:pPr>
+        <w:numPr>
+          <w:numId w:val="0"/>
+        </w:numPr>
+        <w:rPr>
+          <w:rFonts w:hint="default"/>
+        </w:rPr>
+      </w:pPr>
+    </w:p>
+    <w:p>
+      <w:pPr>
+        <w:numPr>
+          <w:numId w:val="0"/>
+        </w:numPr>
+        <w:rPr>
+          <w:rFonts w:hint="default"/>
+        </w:rPr>
+      </w:pPr>
+      <w:r>
+        <w:rPr>
+          <w:rFonts w:hint="default"/>
+          <w:lang w:val="ru-RU"/>
+        </w:rPr>
+        <w:t xml:space="preserve">1. </w:t>
+      </w:r>
+      <w:r>
+        <w:rPr>
+          <w:rFonts w:hint="default"/>
+        </w:rPr>
+        <w:t>Установите Jenkins и настройте pipeline.</w:t>
+      </w:r>
+    </w:p>
+    <w:p>
+      <w:pPr>
+        <w:numPr>
+          <w:numId w:val="0"/>
+        </w:numPr>
+        <w:rPr>
+          <w:rFonts w:hint="default"/>
+        </w:rPr>
+      </w:pPr>
+    </w:p>
+    <w:p>
+      <w:pPr>
+        <w:numPr>
+          <w:numId w:val="0"/>
+        </w:numPr>
+        <w:rPr>
+          <w:rFonts w:hint="default"/>
+        </w:rPr>
+      </w:pPr>
+      <w:r>
+        <w:rPr>
+          <w:rFonts w:hint="default"/>
+          <w:lang w:val="ru-RU"/>
+        </w:rPr>
+        <w:t xml:space="preserve">2. </w:t>
+      </w:r>
+      <w:r>
+        <w:rPr>
+          <w:rFonts w:hint="default"/>
+        </w:rPr>
+        <w:t>Создайте файл Jenkinsfile в корне репозитория:</w:t>
+      </w:r>
+    </w:p>
+    <w:p>
+      <w:pPr>
+        <w:numPr>
+          <w:numId w:val="0"/>
+        </w:numPr>
+        <w:rPr>
+          <w:rFonts w:hint="default"/>
+        </w:rPr>
+      </w:pPr>
+    </w:p>
+    <w:p>
+      <w:pPr>
+        <w:numPr>
+          <w:numId w:val="0"/>
+        </w:numPr>
+        <w:rPr>
+          <w:rFonts w:hint="default"/>
+        </w:rPr>
+      </w:pPr>
+      <w:r>
+        <w:rPr>
+          <w:rFonts w:hint="default"/>
+        </w:rPr>
+        <w:t>pipeline {</w:t>
+      </w:r>
+    </w:p>
+    <w:p>
+      <w:pPr>
+        <w:numPr>
+          <w:numId w:val="0"/>
+        </w:numPr>
+        <w:rPr>
+          <w:rFonts w:hint="default"/>
+        </w:rPr>
+      </w:pPr>
+      <w:r>
+        <w:rPr>
+          <w:rFonts w:hint="default"/>
+        </w:rPr>
+        <w:t xml:space="preserve">    agent any</w:t>
+      </w:r>
+    </w:p>
+    <w:p>
+      <w:pPr>
+        <w:numPr>
+          <w:numId w:val="0"/>
+        </w:numPr>
+        <w:rPr>
+          <w:rFonts w:hint="default"/>
+        </w:rPr>
+      </w:pPr>
+    </w:p>
+    <w:p>
+      <w:pPr>
+        <w:numPr>
+          <w:numId w:val="0"/>
+        </w:numPr>
+        <w:rPr>
+          <w:rFonts w:hint="default"/>
+        </w:rPr>
+      </w:pPr>
+      <w:r>
+        <w:rPr>
+          <w:rFonts w:hint="default"/>
+        </w:rPr>
+        <w:t xml:space="preserve">    stages {</w:t>
+      </w:r>
+    </w:p>
+    <w:p>
+      <w:pPr>
+        <w:numPr>
+          <w:numId w:val="0"/>
+        </w:numPr>
+        <w:rPr>
+          <w:rFonts w:hint="default"/>
+        </w:rPr>
+      </w:pPr>
+      <w:r>
+        <w:rPr>
+          <w:rFonts w:hint="default"/>
+        </w:rPr>
+        <w:t xml:space="preserve">        stage('Checkout') {</w:t>
+      </w:r>
+    </w:p>
+    <w:p>
+      <w:pPr>
+        <w:numPr>
+          <w:numId w:val="0"/>
+        </w:numPr>
+        <w:rPr>
+          <w:rFonts w:hint="default"/>
+        </w:rPr>
+      </w:pPr>
+      <w:r>
+        <w:rPr>
+          <w:rFonts w:hint="default"/>
+        </w:rPr>
+        <w:t xml:space="preserve">            steps {</w:t>
+      </w:r>
+    </w:p>
+    <w:p>
+      <w:pPr>
+        <w:numPr>
+          <w:numId w:val="0"/>
+        </w:numPr>
+        <w:rPr>
+          <w:rFonts w:hint="default"/>
+        </w:rPr>
+      </w:pPr>
+      <w:r>
+        <w:rPr>
+          <w:rFonts w:hint="default"/>
+        </w:rPr>
+        <w:t xml:space="preserve">                git 'https://github.com/your-repo.git'</w:t>
+      </w:r>
+    </w:p>
+    <w:p>
+      <w:pPr>
+        <w:numPr>
+          <w:numId w:val="0"/>
+        </w:numPr>
+        <w:rPr>
+          <w:rFonts w:hint="default"/>
+        </w:rPr>
+      </w:pPr>
+      <w:r>
+        <w:rPr>
+          <w:rFonts w:hint="default"/>
+        </w:rPr>
+        <w:t xml:space="preserve">            }</w:t>
+      </w:r>
+    </w:p>
+    <w:p>
+      <w:pPr>
+        <w:numPr>
+          <w:numId w:val="0"/>
+        </w:numPr>
+        <w:rPr>
+          <w:rFonts w:hint="default"/>
+        </w:rPr>
+      </w:pPr>
+      <w:r>
+        <w:rPr>
+          <w:rFonts w:hint="default"/>
+        </w:rPr>
+        <w:t xml:space="preserve">        }</w:t>
+      </w:r>
+    </w:p>
+    <w:p>
+      <w:pPr>
+        <w:numPr>
+          <w:numId w:val="0"/>
+        </w:numPr>
+        <w:rPr>
+          <w:rFonts w:hint="default"/>
+        </w:rPr>
+      </w:pPr>
+    </w:p>
+    <w:p>
+      <w:pPr>
+        <w:numPr>
+          <w:numId w:val="0"/>
+        </w:numPr>
+        <w:rPr>
+          <w:rFonts w:hint="default"/>
+        </w:rPr>
+      </w:pPr>
+      <w:r>
+        <w:rPr>
+          <w:rFonts w:hint="default"/>
+        </w:rPr>
+        <w:t xml:space="preserve">        stage('Install dependencies') {</w:t>
+      </w:r>
+    </w:p>
+    <w:p>
+      <w:pPr>
+        <w:numPr>
+          <w:numId w:val="0"/>
+        </w:numPr>
+        <w:rPr>
+          <w:rFonts w:hint="default"/>
+        </w:rPr>
+      </w:pPr>
+      <w:r>
+        <w:rPr>
+          <w:rFonts w:hint="default"/>
+        </w:rPr>
+        <w:t xml:space="preserve">            steps {</w:t>
+      </w:r>
+    </w:p>
+    <w:p>
+      <w:pPr>
+        <w:numPr>
+          <w:numId w:val="0"/>
+        </w:numPr>
+        <w:rPr>
+          <w:rFonts w:hint="default"/>
+        </w:rPr>
+      </w:pPr>
+      <w:r>
+        <w:rPr>
+          <w:rFonts w:hint="default"/>
+        </w:rPr>
+        <w:t xml:space="preserve">                sh 'pip install -r requirements.txt'</w:t>
+      </w:r>
+    </w:p>
+    <w:p>
+      <w:pPr>
+        <w:numPr>
+          <w:numId w:val="0"/>
+        </w:numPr>
+        <w:rPr>
+          <w:rFonts w:hint="default"/>
+        </w:rPr>
+      </w:pPr>
+      <w:r>
+        <w:rPr>
+          <w:rFonts w:hint="default"/>
+        </w:rPr>
+        <w:t xml:space="preserve">            }</w:t>
+      </w:r>
+    </w:p>
+    <w:p>
+      <w:pPr>
+        <w:numPr>
+          <w:numId w:val="0"/>
+        </w:numPr>
+        <w:rPr>
+          <w:rFonts w:hint="default"/>
+        </w:rPr>
+      </w:pPr>
+      <w:r>
+        <w:rPr>
+          <w:rFonts w:hint="default"/>
+        </w:rPr>
+        <w:t xml:space="preserve">        }</w:t>
+      </w:r>
+    </w:p>
+    <w:p>
+      <w:pPr>
+        <w:numPr>
+          <w:numId w:val="0"/>
+        </w:numPr>
+        <w:rPr>
+          <w:rFonts w:hint="default"/>
+        </w:rPr>
+      </w:pPr>
+    </w:p>
+    <w:p>
+      <w:pPr>
+        <w:numPr>
+          <w:numId w:val="0"/>
+        </w:numPr>
+        <w:rPr>
+          <w:rFonts w:hint="default"/>
+        </w:rPr>
+      </w:pPr>
+      <w:r>
+        <w:rPr>
+          <w:rFonts w:hint="default"/>
+        </w:rPr>
+        <w:t xml:space="preserve">        stage('Run tests') {</w:t>
+      </w:r>
+    </w:p>
+    <w:p>
+      <w:pPr>
+        <w:numPr>
+          <w:numId w:val="0"/>
+        </w:numPr>
+        <w:rPr>
+          <w:rFonts w:hint="default"/>
+        </w:rPr>
+      </w:pPr>
+      <w:r>
+        <w:rPr>
+          <w:rFonts w:hint="default"/>
+        </w:rPr>
+        <w:t xml:space="preserve">            steps {</w:t>
+      </w:r>
+    </w:p>
+    <w:p>
+      <w:pPr>
+        <w:numPr>
+          <w:numId w:val="0"/>
+        </w:numPr>
+        <w:rPr>
+          <w:rFonts w:hint="default"/>
+        </w:rPr>
+      </w:pPr>
+      <w:r>
+        <w:rPr>
+          <w:rFonts w:hint="default"/>
+        </w:rPr>
+        <w:t xml:space="preserve">                sh 'pytest'</w:t>
+      </w:r>
+    </w:p>
+    <w:p>
+      <w:pPr>
+        <w:numPr>
+          <w:numId w:val="0"/>
+        </w:numPr>
+        <w:rPr>
+          <w:rFonts w:hint="default"/>
+        </w:rPr>
+      </w:pPr>
+      <w:r>
+        <w:rPr>
+          <w:rFonts w:hint="default"/>
+        </w:rPr>
+        <w:t xml:space="preserve">            }</w:t>
+      </w:r>
+    </w:p>
+    <w:p>
+      <w:pPr>
+        <w:numPr>
+          <w:numId w:val="0"/>
+        </w:numPr>
+        <w:rPr>
+          <w:rFonts w:hint="default"/>
+        </w:rPr>
+      </w:pPr>
+      <w:r>
+        <w:rPr>
+          <w:rFonts w:hint="default"/>
+        </w:rPr>
+        <w:t xml:space="preserve">        }</w:t>
+      </w:r>
+    </w:p>
+    <w:p>
+      <w:pPr>
+        <w:numPr>
+          <w:numId w:val="0"/>
+        </w:numPr>
+        <w:rPr>
+          <w:rFonts w:hint="default"/>
+        </w:rPr>
+      </w:pPr>
+      <w:r>
+        <w:rPr>
+          <w:rFonts w:hint="default"/>
+        </w:rPr>
+        <w:t xml:space="preserve">    }</w:t>
+      </w:r>
+    </w:p>
+    <w:p>
+      <w:pPr>
+        <w:numPr>
+          <w:numId w:val="0"/>
+        </w:numPr>
+        <w:rPr>
+          <w:rFonts w:hint="default"/>
+        </w:rPr>
+      </w:pPr>
+      <w:r>
+        <w:rPr>
+          <w:rFonts w:hint="default"/>
+        </w:rPr>
+        <w:t>}</w:t>
+      </w:r>
+    </w:p>
+    <w:p>
+      <w:pPr>
+        <w:numPr>
+          <w:numId w:val="0"/>
+        </w:numPr>
+        <w:rPr>
+          <w:rFonts w:hint="default"/>
+        </w:rPr>
+      </w:pPr>
+    </w:p>
+    <w:p>
+      <w:pPr>
+        <w:numPr>
+          <w:numId w:val="0"/>
+        </w:numPr>
+        <w:rPr>
+          <w:rFonts w:hint="default"/>
+        </w:rPr>
+      </w:pPr>
+      <w:r>
+        <w:rPr>
+          <w:rFonts w:hint="default"/>
+        </w:rPr>
+        <w:t xml:space="preserve">                  </w:t>
+      </w:r>
+    </w:p>
+    <w:p>
+      <w:pPr>
+        <w:numPr>
+          <w:numId w:val="0"/>
+        </w:numPr>
+        <w:rPr>
+          <w:rFonts w:hint="default"/>
+        </w:rPr>
+      </w:pPr>
+      <w:r>
+        <w:rPr>
+          <w:rFonts w:hint="default"/>
+          <w:lang w:val="ru-RU"/>
+        </w:rPr>
+        <w:t xml:space="preserve">3. </w:t>
+      </w:r>
+      <w:r>
+        <w:rPr>
+          <w:rFonts w:hint="default"/>
+        </w:rPr>
+        <w:t>Настройте Jenkins для автоматического запуска pipeline при изменениях в репозитории.</w:t>
+      </w:r>
+    </w:p>
+    <w:p>
+      <w:pPr>
+        <w:numPr>
+          <w:numId w:val="0"/>
+        </w:numPr>
+        <w:rPr>
+          <w:rFonts w:hint="default"/>
+        </w:rPr>
+      </w:pPr>
+    </w:p>
+    <w:p>
+      <w:pPr>
+        <w:pStyle w:val="3"/>
+        <w:rPr>
+          <w:rFonts w:hint="default"/>
+        </w:rPr>
+      </w:pPr>
+      <w:r>
+        <w:rPr>
+          <w:rFonts w:hint="default"/>
+        </w:rPr>
+        <w:br w:type="page"/>
+      </w:r>
+    </w:p>
+    <w:p>
+      <w:pPr>
+        <w:pStyle w:val="3"/>
+        <w:rPr>
+          <w:rFonts w:hint="default"/>
+        </w:rPr>
+      </w:pPr>
+      <w:r>
+        <w:rPr>
+          <w:rFonts w:hint="default"/>
+        </w:rPr>
+        <w:t>Частые ошибки и их решение</w:t>
+      </w:r>
+    </w:p>
+    <w:p>
+      <w:pPr>
+        <w:numPr>
+          <w:numId w:val="0"/>
+        </w:numPr>
+        <w:rPr>
+          <w:rFonts w:hint="default"/>
+        </w:rPr>
+      </w:pPr>
+      <w:r>
+        <w:rPr>
+          <w:rFonts w:hint="default"/>
+          <w:b/>
+          <w:bCs/>
+          <w:lang w:val="ru-RU"/>
+        </w:rPr>
+        <w:t xml:space="preserve">1. </w:t>
+      </w:r>
+      <w:r>
+        <w:rPr>
+          <w:rFonts w:hint="default"/>
+          <w:b/>
+          <w:bCs/>
+        </w:rPr>
+        <w:t>Ошибка: Зависимости не установлены.</w:t>
+      </w:r>
+      <w:r>
+        <w:rPr>
+          <w:rFonts w:hint="default"/>
+          <w:b/>
+          <w:bCs/>
+        </w:rPr>
+        <w:br w:type="textWrapping"/>
+      </w:r>
+    </w:p>
+    <w:p>
+      <w:pPr>
+        <w:numPr>
+          <w:numId w:val="0"/>
+        </w:numPr>
+        <w:rPr>
+          <w:rFonts w:hint="default"/>
+        </w:rPr>
+      </w:pPr>
+      <w:r>
+        <w:rPr>
+          <w:rFonts w:hint="default"/>
+        </w:rPr>
+        <w:t>Причина: Файл requirements.txt отсутствует или содержит ошибки.</w:t>
+      </w:r>
+    </w:p>
+    <w:p>
+      <w:pPr>
+        <w:numPr>
+          <w:numId w:val="0"/>
+        </w:numPr>
+        <w:rPr>
+          <w:rFonts w:hint="default"/>
+        </w:rPr>
+      </w:pPr>
+    </w:p>
+    <w:p>
+      <w:pPr>
+        <w:numPr>
+          <w:numId w:val="0"/>
+        </w:numPr>
+        <w:rPr>
+          <w:rFonts w:hint="default"/>
+        </w:rPr>
+      </w:pPr>
+      <w:r>
+        <w:rPr>
+          <w:rFonts w:hint="default"/>
+        </w:rPr>
+        <w:t>Решение: Проверьте файл и установите зависимости вручную.</w:t>
+      </w:r>
+    </w:p>
+    <w:p>
+      <w:pPr>
+        <w:numPr>
+          <w:numId w:val="0"/>
+        </w:numPr>
+        <w:rPr>
+          <w:rFonts w:hint="default"/>
+        </w:rPr>
+      </w:pPr>
+    </w:p>
+    <w:p>
+      <w:pPr>
+        <w:numPr>
+          <w:numId w:val="0"/>
+        </w:numPr>
+        <w:rPr>
+          <w:rFonts w:hint="default"/>
+        </w:rPr>
+      </w:pPr>
+      <w:r>
+        <w:rPr>
+          <w:rFonts w:hint="default"/>
+          <w:b/>
+          <w:bCs/>
+          <w:lang w:val="ru-RU"/>
+        </w:rPr>
+        <w:t xml:space="preserve">2. </w:t>
+      </w:r>
+      <w:r>
+        <w:rPr>
+          <w:rFonts w:hint="default"/>
+          <w:b/>
+          <w:bCs/>
+        </w:rPr>
+        <w:t>Ошибка: Тесты не запускаются.</w:t>
+      </w:r>
+      <w:r>
+        <w:rPr>
+          <w:rFonts w:hint="default"/>
+          <w:b/>
+          <w:bCs/>
+        </w:rPr>
+        <w:br w:type="textWrapping"/>
+      </w:r>
+    </w:p>
+    <w:p>
+      <w:pPr>
+        <w:numPr>
+          <w:numId w:val="0"/>
+        </w:numPr>
+        <w:rPr>
+          <w:rFonts w:hint="default"/>
+        </w:rPr>
+      </w:pPr>
+      <w:r>
+        <w:rPr>
+          <w:rFonts w:hint="default"/>
+        </w:rPr>
+        <w:t>Причина: Неправильный путь к тестам или ошибки в коде.</w:t>
+      </w:r>
+    </w:p>
+    <w:p>
+      <w:pPr>
+        <w:numPr>
+          <w:numId w:val="0"/>
+        </w:numPr>
+        <w:rPr>
+          <w:rFonts w:hint="default"/>
+        </w:rPr>
+      </w:pPr>
+      <w:bookmarkStart w:id="41" w:name="_GoBack"/>
+      <w:bookmarkEnd w:id="41"/>
+    </w:p>
+    <w:p>
+      <w:pPr>
+        <w:numPr>
+          <w:numId w:val="0"/>
+        </w:numPr>
+        <w:rPr>
+          <w:rFonts w:hint="default"/>
+        </w:rPr>
+      </w:pPr>
+      <w:r>
+        <w:rPr>
+          <w:rFonts w:hint="default"/>
+        </w:rPr>
+        <w:t>Решение: Проверьте команду запуска тестов и логи.</w:t>
+      </w:r>
+    </w:p>
+    <w:p>
+      <w:pPr>
+        <w:numPr>
+          <w:numId w:val="0"/>
+        </w:numPr>
+        <w:rPr>
+          <w:rFonts w:hint="default"/>
+        </w:rPr>
+      </w:pPr>
+    </w:p>
+    <w:p>
+      <w:pPr>
+        <w:numPr>
+          <w:numId w:val="0"/>
+        </w:numPr>
+        <w:rPr>
+          <w:rFonts w:hint="default"/>
+          <w:b/>
+          <w:bCs/>
+        </w:rPr>
+      </w:pPr>
+      <w:r>
+        <w:rPr>
+          <w:rFonts w:hint="default"/>
+          <w:b/>
+          <w:bCs/>
+          <w:lang w:val="ru-RU"/>
+        </w:rPr>
+        <w:t xml:space="preserve">3. </w:t>
+      </w:r>
+      <w:r>
+        <w:rPr>
+          <w:rFonts w:hint="default"/>
+          <w:b/>
+          <w:bCs/>
+        </w:rPr>
+        <w:t>Ошибка: Нет доступа к репозиторию.</w:t>
+      </w:r>
+    </w:p>
+    <w:p>
+      <w:pPr>
+        <w:numPr>
+          <w:numId w:val="0"/>
+        </w:numPr>
+        <w:rPr>
+          <w:rFonts w:hint="default"/>
+        </w:rPr>
+      </w:pPr>
+    </w:p>
+    <w:p>
+      <w:pPr>
+        <w:numPr>
+          <w:numId w:val="0"/>
+        </w:numPr>
+        <w:rPr>
+          <w:rFonts w:hint="default"/>
+        </w:rPr>
+      </w:pPr>
+      <w:r>
+        <w:rPr>
+          <w:rFonts w:hint="default"/>
+        </w:rPr>
+        <w:t>Причина: Неправильные настройки доступа в CI/CD.</w:t>
+      </w:r>
+    </w:p>
+    <w:p>
+      <w:pPr>
+        <w:numPr>
+          <w:numId w:val="0"/>
+        </w:numPr>
+        <w:rPr>
+          <w:rFonts w:hint="default"/>
+        </w:rPr>
+      </w:pPr>
+    </w:p>
+    <w:p>
+      <w:pPr>
+        <w:numPr>
+          <w:numId w:val="0"/>
+        </w:numPr>
+        <w:rPr>
+          <w:rFonts w:hint="default"/>
+        </w:rPr>
+      </w:pPr>
+      <w:r>
+        <w:rPr>
+          <w:rFonts w:hint="default"/>
+        </w:rPr>
+        <w:t>Решение: Проверьте токены и права доступа.</w:t>
+      </w:r>
+    </w:p>
+    <w:p>
+      <w:pPr>
+        <w:numPr>
+          <w:numId w:val="0"/>
+        </w:numPr>
+        <w:rPr>
+          <w:rStyle w:val="16"/>
+          <w:rFonts w:hint="default"/>
+        </w:rPr>
+      </w:pPr>
+      <w:r>
+        <w:rPr>
+          <w:rFonts w:hint="default"/>
+        </w:rPr>
+        <w:br w:type="textWrapping"/>
+      </w:r>
+      <w:r>
+        <w:rPr>
+          <w:rStyle w:val="16"/>
+          <w:rFonts w:hint="default"/>
+        </w:rPr>
+        <w:t>Поздравляю!</w:t>
+      </w:r>
+      <w:r>
+        <w:rPr>
+          <w:rStyle w:val="16"/>
+          <w:rFonts w:hint="default"/>
+          <w:lang w:val="ru-RU"/>
+        </w:rPr>
+        <w:t xml:space="preserve"> </w:t>
+      </w:r>
+      <w:r>
+        <w:rPr>
+          <w:rStyle w:val="16"/>
+          <w:rFonts w:hint="default"/>
+        </w:rPr>
+        <w:t>Вы настроили автоматический запуск тестов в CI/CD:</w:t>
+      </w:r>
+    </w:p>
+    <w:p>
+      <w:pPr>
+        <w:numPr>
+          <w:numId w:val="0"/>
+        </w:numPr>
+        <w:rPr>
+          <w:rFonts w:hint="default"/>
+        </w:rPr>
+      </w:pPr>
+    </w:p>
+    <w:p>
+      <w:pPr>
+        <w:numPr>
+          <w:numId w:val="0"/>
+        </w:numPr>
+        <w:rPr>
+          <w:rFonts w:hint="default"/>
+        </w:rPr>
+      </w:pPr>
+      <w:r>
+        <w:rPr>
+          <w:rFonts w:hint="default"/>
+          <w:lang w:val="ru-RU"/>
+        </w:rPr>
+        <w:t xml:space="preserve">1. </w:t>
+      </w:r>
+      <w:r>
+        <w:rPr>
+          <w:rFonts w:hint="default"/>
+        </w:rPr>
+        <w:t>Создали workflow-файл для GitHub Actions.</w:t>
+      </w:r>
+    </w:p>
+    <w:p>
+      <w:pPr>
+        <w:numPr>
+          <w:numId w:val="0"/>
+        </w:numPr>
+        <w:rPr>
+          <w:rFonts w:hint="default"/>
+        </w:rPr>
+      </w:pPr>
+    </w:p>
+    <w:p>
+      <w:pPr>
+        <w:numPr>
+          <w:numId w:val="0"/>
+        </w:numPr>
+        <w:rPr>
+          <w:rFonts w:hint="default"/>
+        </w:rPr>
+      </w:pPr>
+      <w:r>
+        <w:rPr>
+          <w:rFonts w:hint="default"/>
+          <w:lang w:val="ru-RU"/>
+        </w:rPr>
+        <w:t xml:space="preserve">2. </w:t>
+      </w:r>
+      <w:r>
+        <w:rPr>
+          <w:rFonts w:hint="default"/>
+        </w:rPr>
+        <w:t>Настроили Jenkins для запуска тестов.</w:t>
+      </w:r>
+    </w:p>
+    <w:p>
+      <w:pPr>
+        <w:numPr>
+          <w:numId w:val="0"/>
+        </w:numPr>
+        <w:rPr>
+          <w:rFonts w:hint="default"/>
+        </w:rPr>
+      </w:pPr>
+    </w:p>
+    <w:p>
+      <w:pPr>
+        <w:numPr>
+          <w:numId w:val="0"/>
+        </w:numPr>
+        <w:rPr>
+          <w:rFonts w:hint="default"/>
+          <w:b/>
+          <w:bCs/>
+        </w:rPr>
+      </w:pPr>
+      <w:r>
+        <w:rPr>
+          <w:rFonts w:hint="default"/>
+          <w:b/>
+          <w:bCs/>
+          <w:lang w:val="ru-RU"/>
+        </w:rPr>
+        <w:t xml:space="preserve">3. </w:t>
+      </w:r>
+      <w:r>
+        <w:rPr>
+          <w:rFonts w:hint="default"/>
+          <w:b/>
+          <w:bCs/>
+        </w:rPr>
+        <w:t>Убедились, что тесты запускаются при каждом изменении кода.</w:t>
       </w:r>
     </w:p>
     <w:sectPr>
@@ -12808,6 +16136,7 @@
     <w:name w:val="heading 2"/>
     <w:basedOn w:val="1"/>
     <w:next w:val="1"/>
+    <w:link w:val="16"/>
     <w:unhideWhenUsed/>
     <w:qFormat/>
     <w:uiPriority w:val="0"/>
@@ -12951,6 +16280,21 @@
     <w:tcPr>
       <w:textDirection w:val="lrTb"/>
     </w:tcPr>
+  </w:style>
+  <w:style w:type="character" w:customStyle="1" w:styleId="16">
+    <w:name w:val="Заголовок 2 Char"/>
+    <w:link w:val="3"/>
+    <w:uiPriority w:val="0"/>
+    <w:rPr>
+      <w:rFonts w:ascii="Arial" w:hAnsi="Arial" w:cs="Arial"/>
+      <w:b/>
+      <w:bCs/>
+      <w:i/>
+      <w:iCs/>
+      <w:kern w:val="0"/>
+      <w:sz w:val="28"/>
+      <w:szCs w:val="28"/>
+    </w:rPr>
   </w:style>
 </w:styles>
 </file>

</xml_diff>